<commit_message>
Stage 2- Data Understanding- report (Done by Carlos and Suelen)
The report is being done by both of us (including writing and ideas). In this second step we developed the data Understanding stage 2.
</commit_message>
<xml_diff>
--- a/Final_Project_Carlos_Suelen.docx
+++ b/Final_Project_Carlos_Suelen.docx
@@ -1848,14 +1848,1738 @@
     <w:p/>
     <w:p/>
     <w:p/>
+    <w:p>
+      <w:pPr>
+        <w:pStyle w:val="Heading1"/>
+        <w:ind w:left="567" w:hanging="567"/>
+        <w:rPr>
+          <w:rFonts w:ascii="Serif" w:hAnsi="Serif" w:cs="Arial"/>
+        </w:rPr>
+      </w:pPr>
+      <w:bookmarkStart w:id="20" w:name="_Toc229330721"/>
+      <w:r>
+        <w:rPr>
+          <w:rFonts w:ascii="Serif" w:hAnsi="Serif" w:cs="Arial"/>
+          <w:sz w:val="36"/>
+          <w:szCs w:val="36"/>
+        </w:rPr>
+        <w:t>2 .</w:t>
+      </w:r>
+      <w:r>
+        <w:rPr>
+          <w:rFonts w:ascii="Serif" w:hAnsi="Serif" w:cs="Arial"/>
+          <w:bCs/>
+          <w:sz w:val="36"/>
+          <w:szCs w:val="36"/>
+        </w:rPr>
+        <w:t>CRISP-DM stage two – data understanding</w:t>
+      </w:r>
+      <w:bookmarkEnd w:id="20"/>
+    </w:p>
+    <w:p>
+      <w:pPr>
+        <w:jc w:val="both"/>
+        <w:rPr>
+          <w:rFonts w:ascii="Serif" w:hAnsi="Serif" w:cs="Arial"/>
+        </w:rPr>
+      </w:pPr>
+      <w:r>
+        <w:rPr>
+          <w:rFonts w:ascii="Serif" w:hAnsi="Serif" w:cs="Arial"/>
+        </w:rPr>
+        <w:t>To develop the model, three datasets were initially collected to explore the relationship between deforestation and CO₂ emissions. The data was obtained from publicly available sources, including TerraBrasilis for deforestation monitoring (TerraBrasilis, n.d.), TRASE for livestock production (zu Ermgassen et al., 2023), and INPE for CO₂ emissions data (Crispim and Bezerra, 2019). An exploratory data analysis (EDA) was conducted on all datasets; however, integrating them was not suitable for the scope of this project.</w:t>
+      </w:r>
+    </w:p>
+    <w:p>
+      <w:pPr>
+        <w:jc w:val="both"/>
+        <w:rPr>
+          <w:rFonts w:ascii="Serif" w:hAnsi="Serif" w:cs="Arial"/>
+        </w:rPr>
+      </w:pPr>
+      <w:r>
+        <w:rPr>
+          <w:rFonts w:ascii="Serif" w:hAnsi="Serif" w:cs="Arial"/>
+        </w:rPr>
+        <w:t xml:space="preserve">The primary objective is to predict CO₂ emissions specifically associated with beef production. While the deforestation and CO₂ datasets provide aggregate values from multiple sources, they do not isolate emissions or deforestation caused by cattle-related activities. Including these variables would introduce noise and reduce the relevance of the model. In contrast, the </w:t>
+      </w:r>
+      <w:r>
+        <w:rPr>
+          <w:rFonts w:ascii="Serif" w:hAnsi="Serif" w:cs="Arial"/>
+          <w:i/>
+          <w:iCs/>
+        </w:rPr>
+        <w:t>Beef Amazon</w:t>
+      </w:r>
+      <w:r>
+        <w:rPr>
+          <w:rFonts w:ascii="Serif" w:hAnsi="Serif" w:cs="Arial"/>
+        </w:rPr>
+        <w:t xml:space="preserve"> dataset contains targeted features directly linked to cattle-driven deforestation and emissions. Therefore, only this dataset was selected for further analysis.</w:t>
+      </w:r>
+    </w:p>
+    <w:p>
+      <w:pPr>
+        <w:jc w:val="both"/>
+        <w:rPr>
+          <w:rFonts w:ascii="Serif" w:hAnsi="Serif" w:cs="Arial"/>
+        </w:rPr>
+      </w:pPr>
+    </w:p>
+    <w:p>
+      <w:pPr>
+        <w:pStyle w:val="Heading2"/>
+        <w:rPr>
+          <w:rFonts w:ascii="Serif" w:hAnsi="Serif"/>
+        </w:rPr>
+      </w:pPr>
+      <w:bookmarkStart w:id="21" w:name="_Toc229330722"/>
+      <w:r>
+        <w:rPr>
+          <w:rFonts w:ascii="Serif" w:hAnsi="Serif"/>
+        </w:rPr>
+        <w:t>2.1 Dataset Formats and problems encountered</w:t>
+      </w:r>
+      <w:bookmarkEnd w:id="21"/>
+    </w:p>
+    <w:p>
+      <w:pPr>
+        <w:jc w:val="both"/>
+        <w:rPr>
+          <w:rFonts w:ascii="Serif" w:hAnsi="Serif" w:cs="Arial"/>
+        </w:rPr>
+      </w:pPr>
+      <w:r>
+        <w:rPr>
+          <w:rFonts w:ascii="Serif" w:hAnsi="Serif" w:cs="Arial"/>
+          <w:b/>
+          <w:bCs/>
+        </w:rPr>
+        <w:t>1</w:t>
+      </w:r>
+      <w:r>
+        <w:rPr>
+          <w:rFonts w:ascii="Serif" w:hAnsi="Serif" w:cs="Arial"/>
+        </w:rPr>
+        <w:t xml:space="preserve">- The </w:t>
+      </w:r>
+      <w:r>
+        <w:rPr>
+          <w:rFonts w:ascii="Serif" w:hAnsi="Serif"/>
+          <w:i/>
+          <w:iCs/>
+        </w:rPr>
+        <w:t>beef_amazon</w:t>
+      </w:r>
+      <w:r>
+        <w:rPr>
+          <w:rFonts w:ascii="Serif" w:hAnsi="Serif"/>
+        </w:rPr>
+        <w:t xml:space="preserve"> </w:t>
+      </w:r>
+      <w:r>
+        <w:rPr>
+          <w:rFonts w:ascii="Serif" w:hAnsi="Serif" w:cs="Arial"/>
+        </w:rPr>
+        <w:t>dataset was provided in CSV format. For this project, the dataset was filtered to include only records from the Amazon region, as this is the focus of the analysis.</w:t>
+      </w:r>
+    </w:p>
+    <w:p>
+      <w:pPr>
+        <w:jc w:val="both"/>
+        <w:rPr>
+          <w:rFonts w:ascii="Serif" w:hAnsi="Serif" w:cs="Arial"/>
+        </w:rPr>
+      </w:pPr>
+      <w:r>
+        <w:rPr>
+          <w:rFonts w:ascii="Serif" w:hAnsi="Serif" w:cs="Arial"/>
+          <w:noProof/>
+          <w:color w:val="000000"/>
+          <w:bdr w:val="none" w:sz="0" w:space="0" w:color="auto" w:frame="1"/>
+        </w:rPr>
+        <w:drawing>
+          <wp:anchor distT="0" distB="0" distL="114300" distR="114300" simplePos="0" relativeHeight="251659264" behindDoc="0" locked="0" layoutInCell="1" allowOverlap="1" wp14:anchorId="2AC05F43" wp14:editId="31134982">
+            <wp:simplePos x="0" y="0"/>
+            <wp:positionH relativeFrom="column">
+              <wp:posOffset>830580</wp:posOffset>
+            </wp:positionH>
+            <wp:positionV relativeFrom="paragraph">
+              <wp:posOffset>189230</wp:posOffset>
+            </wp:positionV>
+            <wp:extent cx="3943350" cy="1362075"/>
+            <wp:effectExtent l="0" t="0" r="0" b="9525"/>
+            <wp:wrapSquare wrapText="bothSides"/>
+            <wp:docPr id="1896048902" name="Picture 2"/>
+            <wp:cNvGraphicFramePr>
+              <a:graphicFrameLocks xmlns:a="http://schemas.openxmlformats.org/drawingml/2006/main" noChangeAspect="1"/>
+            </wp:cNvGraphicFramePr>
+            <a:graphic xmlns:a="http://schemas.openxmlformats.org/drawingml/2006/main">
+              <a:graphicData uri="http://schemas.openxmlformats.org/drawingml/2006/picture">
+                <pic:pic xmlns:pic="http://schemas.openxmlformats.org/drawingml/2006/picture">
+                  <pic:nvPicPr>
+                    <pic:cNvPr id="0" name="Picture 3"/>
+                    <pic:cNvPicPr>
+                      <a:picLocks noChangeAspect="1" noChangeArrowheads="1"/>
+                    </pic:cNvPicPr>
+                  </pic:nvPicPr>
+                  <pic:blipFill>
+                    <a:blip r:embed="rId8">
+                      <a:extLst>
+                        <a:ext uri="{28A0092B-C50C-407E-A947-70E740481C1C}">
+                          <a14:useLocalDpi xmlns:a14="http://schemas.microsoft.com/office/drawing/2010/main" val="0"/>
+                        </a:ext>
+                      </a:extLst>
+                    </a:blip>
+                    <a:srcRect/>
+                    <a:stretch>
+                      <a:fillRect/>
+                    </a:stretch>
+                  </pic:blipFill>
+                  <pic:spPr bwMode="auto">
+                    <a:xfrm>
+                      <a:off x="0" y="0"/>
+                      <a:ext cx="3943350" cy="1362075"/>
+                    </a:xfrm>
+                    <a:prstGeom prst="rect">
+                      <a:avLst/>
+                    </a:prstGeom>
+                    <a:noFill/>
+                    <a:ln>
+                      <a:noFill/>
+                    </a:ln>
+                  </pic:spPr>
+                </pic:pic>
+              </a:graphicData>
+            </a:graphic>
+            <wp14:sizeRelH relativeFrom="page">
+              <wp14:pctWidth>0</wp14:pctWidth>
+            </wp14:sizeRelH>
+            <wp14:sizeRelV relativeFrom="page">
+              <wp14:pctHeight>0</wp14:pctHeight>
+            </wp14:sizeRelV>
+          </wp:anchor>
+        </w:drawing>
+      </w:r>
+    </w:p>
+    <w:p>
+      <w:pPr>
+        <w:jc w:val="both"/>
+        <w:rPr>
+          <w:rFonts w:ascii="Serif" w:hAnsi="Serif" w:cs="Arial"/>
+        </w:rPr>
+      </w:pPr>
+    </w:p>
+    <w:p>
+      <w:pPr>
+        <w:jc w:val="both"/>
+        <w:rPr>
+          <w:rFonts w:ascii="Serif" w:hAnsi="Serif" w:cs="Arial"/>
+        </w:rPr>
+      </w:pPr>
+    </w:p>
+    <w:p>
+      <w:pPr>
+        <w:jc w:val="both"/>
+        <w:rPr>
+          <w:rFonts w:ascii="Serif" w:hAnsi="Serif" w:cs="Arial"/>
+        </w:rPr>
+      </w:pPr>
+    </w:p>
+    <w:p>
+      <w:pPr>
+        <w:jc w:val="both"/>
+        <w:rPr>
+          <w:rFonts w:ascii="Serif" w:hAnsi="Serif" w:cs="Arial"/>
+        </w:rPr>
+      </w:pPr>
+    </w:p>
+    <w:p>
+      <w:pPr>
+        <w:jc w:val="both"/>
+        <w:rPr>
+          <w:rFonts w:ascii="Serif" w:hAnsi="Serif" w:cs="Arial"/>
+        </w:rPr>
+      </w:pPr>
+    </w:p>
+    <w:p>
+      <w:pPr>
+        <w:jc w:val="both"/>
+        <w:rPr>
+          <w:rFonts w:ascii="Serif" w:hAnsi="Serif" w:cs="Arial"/>
+        </w:rPr>
+      </w:pPr>
+    </w:p>
+    <w:p>
+      <w:pPr>
+        <w:jc w:val="both"/>
+        <w:rPr>
+          <w:rFonts w:ascii="Serif" w:hAnsi="Serif" w:cs="Arial"/>
+        </w:rPr>
+      </w:pPr>
+    </w:p>
+    <w:p>
+      <w:pPr>
+        <w:pStyle w:val="Heading2"/>
+        <w:rPr>
+          <w:rFonts w:ascii="Serif" w:hAnsi="Serif"/>
+        </w:rPr>
+      </w:pPr>
+      <w:bookmarkStart w:id="22" w:name="_Toc229330723"/>
+      <w:r>
+        <w:rPr>
+          <w:rFonts w:ascii="Serif" w:hAnsi="Serif"/>
+        </w:rPr>
+        <w:t>2.2 Data description report</w:t>
+      </w:r>
+      <w:bookmarkEnd w:id="22"/>
+    </w:p>
+    <w:p>
+      <w:pPr>
+        <w:pStyle w:val="Heading4"/>
+        <w:rPr>
+          <w:rFonts w:ascii="Serif" w:hAnsi="Serif"/>
+        </w:rPr>
+      </w:pPr>
+      <w:r>
+        <w:rPr>
+          <w:rFonts w:ascii="Serif" w:hAnsi="Serif"/>
+        </w:rPr>
+        <w:t xml:space="preserve"> Number of records</w:t>
+      </w:r>
+    </w:p>
+    <w:p>
+      <w:pPr>
+        <w:rPr>
+          <w:rFonts w:ascii="Serif" w:hAnsi="Serif"/>
+        </w:rPr>
+      </w:pPr>
+      <w:r>
+        <w:rPr>
+          <w:rFonts w:ascii="Serif" w:hAnsi="Serif"/>
+        </w:rPr>
+        <w:t xml:space="preserve">The number of records in the </w:t>
+      </w:r>
+      <w:r>
+        <w:rPr>
+          <w:rFonts w:ascii="Serif" w:hAnsi="Serif"/>
+          <w:i/>
+          <w:iCs/>
+        </w:rPr>
+        <w:t>beef_amazon</w:t>
+      </w:r>
+      <w:r>
+        <w:rPr>
+          <w:rFonts w:ascii="Serif" w:hAnsi="Serif"/>
+        </w:rPr>
+        <w:t xml:space="preserve"> </w:t>
+      </w:r>
+      <w:r>
+        <w:rPr>
+          <w:rFonts w:ascii="Serif" w:hAnsi="Serif" w:cs="Arial"/>
+        </w:rPr>
+        <w:t xml:space="preserve"> </w:t>
+      </w:r>
+      <w:r>
+        <w:rPr>
+          <w:rFonts w:ascii="Serif" w:hAnsi="Serif"/>
+        </w:rPr>
+        <w:t>dataset is 839,727 rows and 26 columns.</w:t>
+      </w:r>
+    </w:p>
+    <w:p>
+      <w:pPr>
+        <w:jc w:val="both"/>
+        <w:rPr>
+          <w:rFonts w:ascii="Serif" w:hAnsi="Serif" w:cs="Arial"/>
+        </w:rPr>
+      </w:pPr>
+    </w:p>
+    <w:p>
+      <w:pPr>
+        <w:jc w:val="both"/>
+        <w:rPr>
+          <w:rFonts w:ascii="Serif" w:hAnsi="Serif" w:cs="Arial"/>
+        </w:rPr>
+      </w:pPr>
+      <w:r>
+        <w:rPr>
+          <w:rFonts w:ascii="Serif" w:hAnsi="Serif"/>
+          <w:noProof/>
+        </w:rPr>
+        <w:lastRenderedPageBreak/>
+        <w:drawing>
+          <wp:anchor distT="0" distB="0" distL="114300" distR="114300" simplePos="0" relativeHeight="251661312" behindDoc="0" locked="0" layoutInCell="1" allowOverlap="1" wp14:anchorId="4BF7D498" wp14:editId="7DA3B949">
+            <wp:simplePos x="0" y="0"/>
+            <wp:positionH relativeFrom="margin">
+              <wp:align>center</wp:align>
+            </wp:positionH>
+            <wp:positionV relativeFrom="paragraph">
+              <wp:posOffset>1270</wp:posOffset>
+            </wp:positionV>
+            <wp:extent cx="3867150" cy="895350"/>
+            <wp:effectExtent l="0" t="0" r="0" b="0"/>
+            <wp:wrapSquare wrapText="bothSides"/>
+            <wp:docPr id="851223480" name="Picture 1"/>
+            <wp:cNvGraphicFramePr>
+              <a:graphicFrameLocks xmlns:a="http://schemas.openxmlformats.org/drawingml/2006/main" noChangeAspect="1"/>
+            </wp:cNvGraphicFramePr>
+            <a:graphic xmlns:a="http://schemas.openxmlformats.org/drawingml/2006/main">
+              <a:graphicData uri="http://schemas.openxmlformats.org/drawingml/2006/picture">
+                <pic:pic xmlns:pic="http://schemas.openxmlformats.org/drawingml/2006/picture">
+                  <pic:nvPicPr>
+                    <pic:cNvPr id="851223480" name=""/>
+                    <pic:cNvPicPr/>
+                  </pic:nvPicPr>
+                  <pic:blipFill>
+                    <a:blip r:embed="rId9">
+                      <a:extLst>
+                        <a:ext uri="{28A0092B-C50C-407E-A947-70E740481C1C}">
+                          <a14:useLocalDpi xmlns:a14="http://schemas.microsoft.com/office/drawing/2010/main" val="0"/>
+                        </a:ext>
+                      </a:extLst>
+                    </a:blip>
+                    <a:stretch>
+                      <a:fillRect/>
+                    </a:stretch>
+                  </pic:blipFill>
+                  <pic:spPr>
+                    <a:xfrm>
+                      <a:off x="0" y="0"/>
+                      <a:ext cx="3867150" cy="895350"/>
+                    </a:xfrm>
+                    <a:prstGeom prst="rect">
+                      <a:avLst/>
+                    </a:prstGeom>
+                  </pic:spPr>
+                </pic:pic>
+              </a:graphicData>
+            </a:graphic>
+            <wp14:sizeRelH relativeFrom="page">
+              <wp14:pctWidth>0</wp14:pctWidth>
+            </wp14:sizeRelH>
+            <wp14:sizeRelV relativeFrom="page">
+              <wp14:pctHeight>0</wp14:pctHeight>
+            </wp14:sizeRelV>
+          </wp:anchor>
+        </w:drawing>
+      </w:r>
+    </w:p>
+    <w:p>
+      <w:pPr>
+        <w:jc w:val="both"/>
+        <w:rPr>
+          <w:rFonts w:ascii="Serif" w:hAnsi="Serif" w:cs="Arial"/>
+        </w:rPr>
+      </w:pPr>
+    </w:p>
+    <w:p>
+      <w:pPr>
+        <w:jc w:val="both"/>
+        <w:rPr>
+          <w:rFonts w:ascii="Serif" w:hAnsi="Serif" w:cs="Arial"/>
+        </w:rPr>
+      </w:pPr>
+    </w:p>
+    <w:p>
+      <w:pPr>
+        <w:pStyle w:val="Heading4"/>
+        <w:rPr>
+          <w:rFonts w:ascii="Serif" w:hAnsi="Serif"/>
+        </w:rPr>
+      </w:pPr>
+      <w:r>
+        <w:rPr>
+          <w:rFonts w:ascii="Serif" w:hAnsi="Serif"/>
+        </w:rPr>
+        <w:t>Identity of the fields</w:t>
+      </w:r>
+    </w:p>
+    <w:p>
+      <w:pPr>
+        <w:jc w:val="both"/>
+        <w:rPr>
+          <w:rFonts w:ascii="Serif" w:hAnsi="Serif"/>
+        </w:rPr>
+      </w:pPr>
+      <w:r>
+        <w:rPr>
+          <w:rFonts w:ascii="Serif" w:hAnsi="Serif"/>
+          <w:noProof/>
+          <w:bdr w:val="none" w:sz="0" w:space="0" w:color="auto" w:frame="1"/>
+        </w:rPr>
+        <w:drawing>
+          <wp:anchor distT="0" distB="0" distL="114300" distR="114300" simplePos="0" relativeHeight="251660288" behindDoc="0" locked="0" layoutInCell="1" allowOverlap="1" wp14:anchorId="0D081F35" wp14:editId="0BA1E722">
+            <wp:simplePos x="0" y="0"/>
+            <wp:positionH relativeFrom="margin">
+              <wp:align>center</wp:align>
+            </wp:positionH>
+            <wp:positionV relativeFrom="paragraph">
+              <wp:posOffset>797560</wp:posOffset>
+            </wp:positionV>
+            <wp:extent cx="5467350" cy="3684270"/>
+            <wp:effectExtent l="0" t="0" r="0" b="0"/>
+            <wp:wrapSquare wrapText="bothSides"/>
+            <wp:docPr id="1940835099" name="Picture 4"/>
+            <wp:cNvGraphicFramePr>
+              <a:graphicFrameLocks xmlns:a="http://schemas.openxmlformats.org/drawingml/2006/main" noChangeAspect="1"/>
+            </wp:cNvGraphicFramePr>
+            <a:graphic xmlns:a="http://schemas.openxmlformats.org/drawingml/2006/main">
+              <a:graphicData uri="http://schemas.openxmlformats.org/drawingml/2006/picture">
+                <pic:pic xmlns:pic="http://schemas.openxmlformats.org/drawingml/2006/picture">
+                  <pic:nvPicPr>
+                    <pic:cNvPr id="0" name="Picture 7"/>
+                    <pic:cNvPicPr>
+                      <a:picLocks noChangeAspect="1" noChangeArrowheads="1"/>
+                    </pic:cNvPicPr>
+                  </pic:nvPicPr>
+                  <pic:blipFill>
+                    <a:blip r:embed="rId10">
+                      <a:extLst>
+                        <a:ext uri="{28A0092B-C50C-407E-A947-70E740481C1C}">
+                          <a14:useLocalDpi xmlns:a14="http://schemas.microsoft.com/office/drawing/2010/main" val="0"/>
+                        </a:ext>
+                      </a:extLst>
+                    </a:blip>
+                    <a:srcRect/>
+                    <a:stretch>
+                      <a:fillRect/>
+                    </a:stretch>
+                  </pic:blipFill>
+                  <pic:spPr bwMode="auto">
+                    <a:xfrm>
+                      <a:off x="0" y="0"/>
+                      <a:ext cx="5467350" cy="3684270"/>
+                    </a:xfrm>
+                    <a:prstGeom prst="rect">
+                      <a:avLst/>
+                    </a:prstGeom>
+                    <a:noFill/>
+                    <a:ln>
+                      <a:noFill/>
+                    </a:ln>
+                  </pic:spPr>
+                </pic:pic>
+              </a:graphicData>
+            </a:graphic>
+            <wp14:sizeRelH relativeFrom="page">
+              <wp14:pctWidth>0</wp14:pctWidth>
+            </wp14:sizeRelH>
+            <wp14:sizeRelV relativeFrom="page">
+              <wp14:pctHeight>0</wp14:pctHeight>
+            </wp14:sizeRelV>
+          </wp:anchor>
+        </w:drawing>
+      </w:r>
+      <w:r>
+        <w:rPr>
+          <w:rFonts w:ascii="Serif" w:hAnsi="Serif"/>
+        </w:rPr>
+        <w:t xml:space="preserve">The </w:t>
+      </w:r>
+      <w:r>
+        <w:rPr>
+          <w:rFonts w:ascii="Serif" w:hAnsi="Serif"/>
+          <w:i/>
+          <w:iCs/>
+        </w:rPr>
+        <w:t>beef_amazon</w:t>
+      </w:r>
+      <w:r>
+        <w:rPr>
+          <w:rFonts w:ascii="Serif" w:hAnsi="Serif"/>
+        </w:rPr>
+        <w:t xml:space="preserve"> dataset includes variables related to production, trade, and environmental impact. It contains geographic, economic, and sustainability fields, with a strong focus on deforestation and CO₂ emissions linked to cattle production.</w:t>
+      </w:r>
+    </w:p>
+    <w:p>
+      <w:pPr>
+        <w:jc w:val="both"/>
+        <w:rPr>
+          <w:rFonts w:ascii="Serif" w:hAnsi="Serif"/>
+        </w:rPr>
+      </w:pPr>
+    </w:p>
+    <w:p>
+      <w:pPr>
+        <w:pStyle w:val="Heading2"/>
+        <w:rPr>
+          <w:rFonts w:ascii="Serif" w:hAnsi="Serif"/>
+        </w:rPr>
+      </w:pPr>
+      <w:bookmarkStart w:id="23" w:name="_Toc229330724"/>
+      <w:r>
+        <w:rPr>
+          <w:rFonts w:ascii="Serif" w:hAnsi="Serif"/>
+        </w:rPr>
+        <w:t>2.2.3 Other surface features</w:t>
+      </w:r>
+      <w:bookmarkEnd w:id="23"/>
+    </w:p>
+    <w:p>
+      <w:pPr>
+        <w:jc w:val="both"/>
+        <w:rPr>
+          <w:rFonts w:ascii="Serif" w:hAnsi="Serif"/>
+        </w:rPr>
+      </w:pPr>
+      <w:r>
+        <w:rPr>
+          <w:rFonts w:ascii="Serif" w:hAnsi="Serif"/>
+        </w:rPr>
+        <w:t xml:space="preserve">Other surface features of the </w:t>
+      </w:r>
+      <w:r>
+        <w:rPr>
+          <w:rFonts w:ascii="Serif" w:hAnsi="Serif"/>
+          <w:i/>
+          <w:iCs/>
+        </w:rPr>
+        <w:t xml:space="preserve">beef_amazon </w:t>
+      </w:r>
+      <w:r>
+        <w:rPr>
+          <w:rFonts w:ascii="Serif" w:hAnsi="Serif"/>
+        </w:rPr>
+        <w:t xml:space="preserve">dataset include a combination of numeric and categorical variables, with most fields stored as categorical (object) types and key variables such as deforestation exposure and CO₂ emissions represented as numeric (float64) values. </w:t>
+      </w:r>
+    </w:p>
+    <w:p>
+      <w:pPr>
+        <w:jc w:val="both"/>
+        <w:rPr>
+          <w:rFonts w:ascii="Serif" w:hAnsi="Serif"/>
+        </w:rPr>
+      </w:pPr>
+    </w:p>
+    <w:p>
+      <w:pPr>
+        <w:pStyle w:val="Heading2"/>
+        <w:rPr>
+          <w:rFonts w:ascii="Serif" w:hAnsi="Serif"/>
+        </w:rPr>
+      </w:pPr>
+      <w:bookmarkStart w:id="24" w:name="_Toc229330725"/>
+      <w:r>
+        <w:rPr>
+          <w:rFonts w:ascii="Serif" w:hAnsi="Serif"/>
+        </w:rPr>
+        <w:lastRenderedPageBreak/>
+        <w:t>2.3 Data exploration report</w:t>
+      </w:r>
+      <w:bookmarkEnd w:id="24"/>
+    </w:p>
+    <w:p>
+      <w:pPr>
+        <w:pStyle w:val="Heading4"/>
+        <w:rPr>
+          <w:rFonts w:ascii="Serif" w:hAnsi="Serif"/>
+        </w:rPr>
+      </w:pPr>
+      <w:r>
+        <w:rPr>
+          <w:rFonts w:ascii="Serif" w:hAnsi="Serif"/>
+        </w:rPr>
+        <w:t>Distribution of the Data</w:t>
+      </w:r>
+    </w:p>
+    <w:p>
+      <w:pPr>
+        <w:jc w:val="both"/>
+        <w:rPr>
+          <w:rFonts w:ascii="Serif" w:hAnsi="Serif"/>
+        </w:rPr>
+      </w:pPr>
+      <w:r>
+        <w:rPr>
+          <w:rFonts w:ascii="Serif" w:hAnsi="Serif"/>
+          <w:noProof/>
+        </w:rPr>
+        <w:drawing>
+          <wp:anchor distT="0" distB="0" distL="114300" distR="114300" simplePos="0" relativeHeight="251663360" behindDoc="0" locked="0" layoutInCell="1" allowOverlap="1" wp14:anchorId="5D2CC3A3" wp14:editId="195A3E93">
+            <wp:simplePos x="0" y="0"/>
+            <wp:positionH relativeFrom="margin">
+              <wp:align>center</wp:align>
+            </wp:positionH>
+            <wp:positionV relativeFrom="paragraph">
+              <wp:posOffset>2100531</wp:posOffset>
+            </wp:positionV>
+            <wp:extent cx="5731510" cy="3820795"/>
+            <wp:effectExtent l="133350" t="114300" r="135890" b="160655"/>
+            <wp:wrapSquare wrapText="bothSides"/>
+            <wp:docPr id="1521839811" name="Picture 1"/>
+            <wp:cNvGraphicFramePr>
+              <a:graphicFrameLocks xmlns:a="http://schemas.openxmlformats.org/drawingml/2006/main" noChangeAspect="1"/>
+            </wp:cNvGraphicFramePr>
+            <a:graphic xmlns:a="http://schemas.openxmlformats.org/drawingml/2006/main">
+              <a:graphicData uri="http://schemas.openxmlformats.org/drawingml/2006/picture">
+                <pic:pic xmlns:pic="http://schemas.openxmlformats.org/drawingml/2006/picture">
+                  <pic:nvPicPr>
+                    <pic:cNvPr id="1521839811" name=""/>
+                    <pic:cNvPicPr/>
+                  </pic:nvPicPr>
+                  <pic:blipFill>
+                    <a:blip r:embed="rId11">
+                      <a:extLst>
+                        <a:ext uri="{28A0092B-C50C-407E-A947-70E740481C1C}">
+                          <a14:useLocalDpi xmlns:a14="http://schemas.microsoft.com/office/drawing/2010/main" val="0"/>
+                        </a:ext>
+                      </a:extLst>
+                    </a:blip>
+                    <a:stretch>
+                      <a:fillRect/>
+                    </a:stretch>
+                  </pic:blipFill>
+                  <pic:spPr>
+                    <a:xfrm>
+                      <a:off x="0" y="0"/>
+                      <a:ext cx="5731510" cy="3820795"/>
+                    </a:xfrm>
+                    <a:prstGeom prst="rect">
+                      <a:avLst/>
+                    </a:prstGeom>
+                    <a:solidFill>
+                      <a:srgbClr val="FFFFFF">
+                        <a:shade val="85000"/>
+                      </a:srgbClr>
+                    </a:solidFill>
+                    <a:ln w="88900" cap="sq">
+                      <a:solidFill>
+                        <a:srgbClr val="FFFFFF"/>
+                      </a:solidFill>
+                      <a:miter lim="800000"/>
+                    </a:ln>
+                    <a:effectLst>
+                      <a:outerShdw blurRad="55000" dist="18000" dir="5400000" algn="tl" rotWithShape="0">
+                        <a:srgbClr val="000000">
+                          <a:alpha val="40000"/>
+                        </a:srgbClr>
+                      </a:outerShdw>
+                    </a:effectLst>
+                    <a:scene3d>
+                      <a:camera prst="orthographicFront"/>
+                      <a:lightRig rig="twoPt" dir="t">
+                        <a:rot lat="0" lon="0" rev="7200000"/>
+                      </a:lightRig>
+                    </a:scene3d>
+                    <a:sp3d>
+                      <a:bevelT w="25400" h="19050"/>
+                      <a:contourClr>
+                        <a:srgbClr val="FFFFFF"/>
+                      </a:contourClr>
+                    </a:sp3d>
+                  </pic:spPr>
+                </pic:pic>
+              </a:graphicData>
+            </a:graphic>
+            <wp14:sizeRelH relativeFrom="page">
+              <wp14:pctWidth>0</wp14:pctWidth>
+            </wp14:sizeRelH>
+            <wp14:sizeRelV relativeFrom="page">
+              <wp14:pctHeight>0</wp14:pctHeight>
+            </wp14:sizeRelV>
+          </wp:anchor>
+        </w:drawing>
+      </w:r>
+      <w:r>
+        <w:rPr>
+          <w:rFonts w:ascii="Serif" w:hAnsi="Serif"/>
+        </w:rPr>
+        <w:t xml:space="preserve">Histograms were used to examine the distribution of numerical variables in the </w:t>
+      </w:r>
+      <w:r>
+        <w:rPr>
+          <w:rFonts w:ascii="Serif" w:hAnsi="Serif"/>
+          <w:i/>
+          <w:iCs/>
+        </w:rPr>
+        <w:t>beef_amazon</w:t>
+      </w:r>
+      <w:r>
+        <w:rPr>
+          <w:rFonts w:ascii="Serif" w:hAnsi="Serif"/>
+        </w:rPr>
+        <w:t xml:space="preserve"> dataset. The majority of variables, including </w:t>
+      </w:r>
+      <w:r>
+        <w:rPr>
+          <w:rFonts w:ascii="Serif" w:hAnsi="Serif"/>
+          <w:i/>
+          <w:iCs/>
+        </w:rPr>
+        <w:t>CO₂ emissions</w:t>
+      </w:r>
+      <w:r>
+        <w:rPr>
+          <w:rFonts w:ascii="Serif" w:hAnsi="Serif"/>
+        </w:rPr>
+        <w:t xml:space="preserve">, </w:t>
+      </w:r>
+      <w:r>
+        <w:rPr>
+          <w:rFonts w:ascii="Serif" w:hAnsi="Serif"/>
+          <w:i/>
+          <w:iCs/>
+        </w:rPr>
+        <w:t>cattle</w:t>
+      </w:r>
+      <w:r>
+        <w:rPr>
+          <w:rFonts w:ascii="Serif" w:hAnsi="Serif"/>
+        </w:rPr>
+        <w:t xml:space="preserve"> </w:t>
+      </w:r>
+      <w:r>
+        <w:rPr>
+          <w:rFonts w:ascii="Serif" w:hAnsi="Serif"/>
+          <w:i/>
+          <w:iCs/>
+        </w:rPr>
+        <w:t>deforestation</w:t>
+      </w:r>
+      <w:r>
+        <w:rPr>
+          <w:rFonts w:ascii="Serif" w:hAnsi="Serif"/>
+        </w:rPr>
+        <w:t xml:space="preserve">, </w:t>
+      </w:r>
+      <w:r>
+        <w:rPr>
+          <w:rFonts w:ascii="Serif" w:hAnsi="Serif"/>
+          <w:i/>
+          <w:iCs/>
+        </w:rPr>
+        <w:t>land use</w:t>
+      </w:r>
+      <w:r>
+        <w:rPr>
+          <w:rFonts w:ascii="Serif" w:hAnsi="Serif"/>
+        </w:rPr>
+        <w:t xml:space="preserve">, and </w:t>
+      </w:r>
+      <w:r>
+        <w:rPr>
+          <w:rFonts w:ascii="Serif" w:hAnsi="Serif"/>
+          <w:i/>
+          <w:iCs/>
+        </w:rPr>
+        <w:t>FOB</w:t>
+      </w:r>
+      <w:r>
+        <w:rPr>
+          <w:rFonts w:ascii="Serif" w:hAnsi="Serif"/>
+        </w:rPr>
+        <w:t xml:space="preserve"> values, exhibit strong right-skewness, with most observations concentrated at lower values and a long tail of higher values. This indicates the presence of extreme values and high variability within the dataset. In contrast, the </w:t>
+      </w:r>
+      <w:r>
+        <w:rPr>
+          <w:rFonts w:ascii="Serif" w:hAnsi="Serif"/>
+          <w:i/>
+          <w:iCs/>
+        </w:rPr>
+        <w:t>year</w:t>
+      </w:r>
+      <w:r>
+        <w:rPr>
+          <w:rFonts w:ascii="Serif" w:hAnsi="Serif"/>
+        </w:rPr>
+        <w:t xml:space="preserve"> variable shows a more uniform distribution, while </w:t>
+      </w:r>
+      <w:r>
+        <w:rPr>
+          <w:rFonts w:ascii="Serif" w:hAnsi="Serif"/>
+          <w:i/>
+          <w:iCs/>
+        </w:rPr>
+        <w:t>volume</w:t>
+      </w:r>
+      <w:r>
+        <w:rPr>
+          <w:rFonts w:ascii="Serif" w:hAnsi="Serif"/>
+        </w:rPr>
+        <w:t xml:space="preserve"> appears more evenly spread compared to the other features. Overall, these patterns suggest that the dataset contains significant skewness and potential outliers, which should be considered during preprocessing and modelling.</w:t>
+      </w:r>
+    </w:p>
+    <w:p>
+      <w:pPr>
+        <w:rPr>
+          <w:rFonts w:ascii="Serif" w:hAnsi="Serif"/>
+        </w:rPr>
+      </w:pPr>
+    </w:p>
+    <w:p>
+      <w:pPr>
+        <w:pStyle w:val="Heading4"/>
+        <w:rPr>
+          <w:rFonts w:ascii="Serif" w:hAnsi="Serif"/>
+        </w:rPr>
+      </w:pPr>
+    </w:p>
+    <w:p>
+      <w:pPr>
+        <w:rPr>
+          <w:rFonts w:ascii="Serif" w:hAnsi="Serif"/>
+        </w:rPr>
+      </w:pPr>
+    </w:p>
+    <w:p>
+      <w:pPr>
+        <w:rPr>
+          <w:rFonts w:ascii="Serif" w:hAnsi="Serif"/>
+        </w:rPr>
+      </w:pPr>
+    </w:p>
+    <w:p>
+      <w:pPr>
+        <w:rPr>
+          <w:rFonts w:ascii="Serif" w:hAnsi="Serif"/>
+        </w:rPr>
+      </w:pPr>
+    </w:p>
+    <w:p>
+      <w:pPr>
+        <w:rPr>
+          <w:rFonts w:ascii="Serif" w:hAnsi="Serif"/>
+        </w:rPr>
+      </w:pPr>
+    </w:p>
+    <w:p>
+      <w:pPr>
+        <w:rPr>
+          <w:rFonts w:ascii="Serif" w:hAnsi="Serif"/>
+        </w:rPr>
+      </w:pPr>
+    </w:p>
+    <w:p>
+      <w:pPr>
+        <w:pStyle w:val="Heading4"/>
+        <w:rPr>
+          <w:rFonts w:ascii="Serif" w:hAnsi="Serif"/>
+        </w:rPr>
+      </w:pPr>
+      <w:r>
+        <w:rPr>
+          <w:rFonts w:ascii="Serif" w:hAnsi="Serif"/>
+        </w:rPr>
+        <w:lastRenderedPageBreak/>
+        <w:t>Checking for outliers</w:t>
+      </w:r>
+    </w:p>
+    <w:p>
+      <w:pPr>
+        <w:jc w:val="both"/>
+        <w:rPr>
+          <w:rFonts w:ascii="Serif" w:hAnsi="Serif"/>
+        </w:rPr>
+      </w:pPr>
+      <w:r>
+        <w:rPr>
+          <w:rFonts w:ascii="Serif" w:hAnsi="Serif"/>
+          <w:noProof/>
+        </w:rPr>
+        <w:drawing>
+          <wp:anchor distT="0" distB="0" distL="114300" distR="114300" simplePos="0" relativeHeight="251664384" behindDoc="0" locked="0" layoutInCell="1" allowOverlap="1" wp14:anchorId="361F58A2" wp14:editId="6B980069">
+            <wp:simplePos x="0" y="0"/>
+            <wp:positionH relativeFrom="margin">
+              <wp:align>center</wp:align>
+            </wp:positionH>
+            <wp:positionV relativeFrom="paragraph">
+              <wp:posOffset>1966595</wp:posOffset>
+            </wp:positionV>
+            <wp:extent cx="5189670" cy="6530906"/>
+            <wp:effectExtent l="114300" t="114300" r="144780" b="137160"/>
+            <wp:wrapSquare wrapText="bothSides"/>
+            <wp:docPr id="1228499494" name="Picture 1"/>
+            <wp:cNvGraphicFramePr>
+              <a:graphicFrameLocks xmlns:a="http://schemas.openxmlformats.org/drawingml/2006/main" noChangeAspect="1"/>
+            </wp:cNvGraphicFramePr>
+            <a:graphic xmlns:a="http://schemas.openxmlformats.org/drawingml/2006/main">
+              <a:graphicData uri="http://schemas.openxmlformats.org/drawingml/2006/picture">
+                <pic:pic xmlns:pic="http://schemas.openxmlformats.org/drawingml/2006/picture">
+                  <pic:nvPicPr>
+                    <pic:cNvPr id="1228499494" name=""/>
+                    <pic:cNvPicPr/>
+                  </pic:nvPicPr>
+                  <pic:blipFill>
+                    <a:blip r:embed="rId12">
+                      <a:extLst>
+                        <a:ext uri="{28A0092B-C50C-407E-A947-70E740481C1C}">
+                          <a14:useLocalDpi xmlns:a14="http://schemas.microsoft.com/office/drawing/2010/main" val="0"/>
+                        </a:ext>
+                      </a:extLst>
+                    </a:blip>
+                    <a:stretch>
+                      <a:fillRect/>
+                    </a:stretch>
+                  </pic:blipFill>
+                  <pic:spPr>
+                    <a:xfrm>
+                      <a:off x="0" y="0"/>
+                      <a:ext cx="5189670" cy="6530906"/>
+                    </a:xfrm>
+                    <a:prstGeom prst="rect">
+                      <a:avLst/>
+                    </a:prstGeom>
+                    <a:solidFill>
+                      <a:srgbClr val="FFFFFF">
+                        <a:shade val="85000"/>
+                      </a:srgbClr>
+                    </a:solidFill>
+                    <a:ln w="88900" cap="sq">
+                      <a:solidFill>
+                        <a:srgbClr val="FFFFFF"/>
+                      </a:solidFill>
+                      <a:miter lim="800000"/>
+                    </a:ln>
+                    <a:effectLst>
+                      <a:outerShdw blurRad="55000" dist="18000" dir="5400000" algn="tl" rotWithShape="0">
+                        <a:srgbClr val="000000">
+                          <a:alpha val="40000"/>
+                        </a:srgbClr>
+                      </a:outerShdw>
+                    </a:effectLst>
+                    <a:scene3d>
+                      <a:camera prst="orthographicFront"/>
+                      <a:lightRig rig="twoPt" dir="t">
+                        <a:rot lat="0" lon="0" rev="7200000"/>
+                      </a:lightRig>
+                    </a:scene3d>
+                    <a:sp3d>
+                      <a:bevelT w="25400" h="19050"/>
+                      <a:contourClr>
+                        <a:srgbClr val="FFFFFF"/>
+                      </a:contourClr>
+                    </a:sp3d>
+                  </pic:spPr>
+                </pic:pic>
+              </a:graphicData>
+            </a:graphic>
+            <wp14:sizeRelH relativeFrom="page">
+              <wp14:pctWidth>0</wp14:pctWidth>
+            </wp14:sizeRelH>
+            <wp14:sizeRelV relativeFrom="page">
+              <wp14:pctHeight>0</wp14:pctHeight>
+            </wp14:sizeRelV>
+          </wp:anchor>
+        </w:drawing>
+      </w:r>
+      <w:r>
+        <w:rPr>
+          <w:rFonts w:ascii="Serif" w:hAnsi="Serif"/>
+        </w:rPr>
+        <w:t xml:space="preserve">Boxplots were used to analyse the spread of numeric variables in the </w:t>
+      </w:r>
+      <w:r>
+        <w:rPr>
+          <w:rFonts w:ascii="Serif" w:hAnsi="Serif"/>
+          <w:i/>
+          <w:iCs/>
+        </w:rPr>
+        <w:t>beef_amazon</w:t>
+      </w:r>
+      <w:r>
+        <w:rPr>
+          <w:rFonts w:ascii="Serif" w:hAnsi="Serif"/>
+        </w:rPr>
+        <w:t xml:space="preserve"> dataset. Most observations are concentrated near zero, while a small number of values extend to very high ranges. These extreme values are particularly noticeable for FOB (above 15 million), CO₂ emissions (above 4 million). </w:t>
+      </w:r>
+      <w:r>
+        <w:rPr>
+          <w:rFonts w:ascii="Serif" w:hAnsi="Serif"/>
+          <w:highlight w:val="yellow"/>
+        </w:rPr>
+        <w:t>This large gap between typical values and extreme observations indicates strong skewness and the presence of significant outliers in the dataset, which may impact the modelling phase, but some models are resistant to outliers, and other may need feature scaling.</w:t>
+      </w:r>
+    </w:p>
+    <w:p>
+      <w:pPr>
+        <w:pStyle w:val="Heading4"/>
+        <w:rPr>
+          <w:rFonts w:ascii="Serif" w:hAnsi="Serif"/>
+        </w:rPr>
+      </w:pPr>
+      <w:r>
+        <w:rPr>
+          <w:rFonts w:ascii="Serif" w:hAnsi="Serif"/>
+        </w:rPr>
+        <w:lastRenderedPageBreak/>
+        <w:t>Relationship between variables</w:t>
+      </w:r>
+    </w:p>
+    <w:p>
+      <w:pPr>
+        <w:rPr>
+          <w:rFonts w:ascii="Serif" w:hAnsi="Serif" w:cs="Arial"/>
+        </w:rPr>
+      </w:pPr>
+      <w:r>
+        <w:rPr>
+          <w:rFonts w:ascii="Serif" w:hAnsi="Serif"/>
+          <w:noProof/>
+          <w:bdr w:val="none" w:sz="0" w:space="0" w:color="auto" w:frame="1"/>
+        </w:rPr>
+        <w:drawing>
+          <wp:anchor distT="0" distB="0" distL="114300" distR="114300" simplePos="0" relativeHeight="251665408" behindDoc="0" locked="0" layoutInCell="1" allowOverlap="1" wp14:anchorId="4154B9E0" wp14:editId="6A6B986B">
+            <wp:simplePos x="0" y="0"/>
+            <wp:positionH relativeFrom="margin">
+              <wp:align>center</wp:align>
+            </wp:positionH>
+            <wp:positionV relativeFrom="paragraph">
+              <wp:posOffset>1668536</wp:posOffset>
+            </wp:positionV>
+            <wp:extent cx="5731510" cy="4836795"/>
+            <wp:effectExtent l="114300" t="114300" r="135890" b="154305"/>
+            <wp:wrapSquare wrapText="bothSides"/>
+            <wp:docPr id="1985490393" name="Picture 14"/>
+            <wp:cNvGraphicFramePr>
+              <a:graphicFrameLocks xmlns:a="http://schemas.openxmlformats.org/drawingml/2006/main" noChangeAspect="1"/>
+            </wp:cNvGraphicFramePr>
+            <a:graphic xmlns:a="http://schemas.openxmlformats.org/drawingml/2006/main">
+              <a:graphicData uri="http://schemas.openxmlformats.org/drawingml/2006/picture">
+                <pic:pic xmlns:pic="http://schemas.openxmlformats.org/drawingml/2006/picture">
+                  <pic:nvPicPr>
+                    <pic:cNvPr id="0" name="Picture 33"/>
+                    <pic:cNvPicPr>
+                      <a:picLocks noChangeAspect="1" noChangeArrowheads="1"/>
+                    </pic:cNvPicPr>
+                  </pic:nvPicPr>
+                  <pic:blipFill>
+                    <a:blip r:embed="rId13">
+                      <a:extLst>
+                        <a:ext uri="{28A0092B-C50C-407E-A947-70E740481C1C}">
+                          <a14:useLocalDpi xmlns:a14="http://schemas.microsoft.com/office/drawing/2010/main" val="0"/>
+                        </a:ext>
+                      </a:extLst>
+                    </a:blip>
+                    <a:srcRect/>
+                    <a:stretch>
+                      <a:fillRect/>
+                    </a:stretch>
+                  </pic:blipFill>
+                  <pic:spPr bwMode="auto">
+                    <a:xfrm>
+                      <a:off x="0" y="0"/>
+                      <a:ext cx="5731510" cy="4836795"/>
+                    </a:xfrm>
+                    <a:prstGeom prst="rect">
+                      <a:avLst/>
+                    </a:prstGeom>
+                    <a:solidFill>
+                      <a:srgbClr val="FFFFFF">
+                        <a:shade val="85000"/>
+                      </a:srgbClr>
+                    </a:solidFill>
+                    <a:ln w="88900" cap="sq">
+                      <a:solidFill>
+                        <a:srgbClr val="FFFFFF"/>
+                      </a:solidFill>
+                      <a:miter lim="800000"/>
+                    </a:ln>
+                    <a:effectLst>
+                      <a:outerShdw blurRad="55000" dist="18000" dir="5400000" algn="tl" rotWithShape="0">
+                        <a:srgbClr val="000000">
+                          <a:alpha val="40000"/>
+                        </a:srgbClr>
+                      </a:outerShdw>
+                    </a:effectLst>
+                    <a:scene3d>
+                      <a:camera prst="orthographicFront"/>
+                      <a:lightRig rig="twoPt" dir="t">
+                        <a:rot lat="0" lon="0" rev="7200000"/>
+                      </a:lightRig>
+                    </a:scene3d>
+                    <a:sp3d>
+                      <a:bevelT w="25400" h="19050"/>
+                      <a:contourClr>
+                        <a:srgbClr val="FFFFFF"/>
+                      </a:contourClr>
+                    </a:sp3d>
+                  </pic:spPr>
+                </pic:pic>
+              </a:graphicData>
+            </a:graphic>
+            <wp14:sizeRelH relativeFrom="page">
+              <wp14:pctWidth>0</wp14:pctWidth>
+            </wp14:sizeRelH>
+            <wp14:sizeRelV relativeFrom="page">
+              <wp14:pctHeight>0</wp14:pctHeight>
+            </wp14:sizeRelV>
+          </wp:anchor>
+        </w:drawing>
+      </w:r>
+      <w:r>
+        <w:rPr>
+          <w:rFonts w:ascii="Serif" w:hAnsi="Serif"/>
+        </w:rPr>
+        <w:t>The scatter matrix reveals a strong linear relationship between CO₂ gross and CO₂ net emissions, indicating a high level of correlation between these variables. This suggests potential redundancy and may introduce multicollinearity</w:t>
+      </w:r>
+      <w:r>
+        <w:rPr>
+          <w:rFonts w:ascii="Serif" w:hAnsi="Serif" w:cs="Arial"/>
+        </w:rPr>
+        <w:t>(Fatima, 2024)</w:t>
+      </w:r>
+      <w:r>
+        <w:rPr>
+          <w:rFonts w:ascii="Serif" w:hAnsi="Serif"/>
+        </w:rPr>
+        <w:t>. FOB and Volume show a strong positive correlation with a clear linear trend, while the other variables are more scattered, suggesting weaker relationships between them. This graph helps in selecting appropriate algorithms, since some models are affected by correlated features, while others can handle them without issues.</w:t>
+      </w:r>
+    </w:p>
+    <w:p>
+      <w:pPr>
+        <w:rPr>
+          <w:rFonts w:ascii="Serif" w:hAnsi="Serif"/>
+        </w:rPr>
+      </w:pPr>
+    </w:p>
+    <w:p>
+      <w:pPr>
+        <w:rPr>
+          <w:rFonts w:ascii="Serif" w:hAnsi="Serif"/>
+        </w:rPr>
+      </w:pPr>
+    </w:p>
+    <w:p>
+      <w:pPr>
+        <w:rPr>
+          <w:rFonts w:ascii="Serif" w:hAnsi="Serif"/>
+        </w:rPr>
+      </w:pPr>
+    </w:p>
+    <w:p>
+      <w:pPr>
+        <w:rPr>
+          <w:rFonts w:ascii="Serif" w:hAnsi="Serif"/>
+        </w:rPr>
+      </w:pPr>
+    </w:p>
+    <w:p>
+      <w:pPr>
+        <w:rPr>
+          <w:rFonts w:ascii="Serif" w:hAnsi="Serif"/>
+        </w:rPr>
+      </w:pPr>
+    </w:p>
+    <w:p>
+      <w:pPr>
+        <w:rPr>
+          <w:rFonts w:ascii="Serif" w:hAnsi="Serif"/>
+        </w:rPr>
+      </w:pPr>
+    </w:p>
+    <w:p>
+      <w:pPr>
+        <w:pStyle w:val="Heading4"/>
+        <w:rPr>
+          <w:rFonts w:ascii="Serif" w:hAnsi="Serif"/>
+        </w:rPr>
+      </w:pPr>
+      <w:r>
+        <w:rPr>
+          <w:rFonts w:ascii="Serif" w:hAnsi="Serif"/>
+        </w:rPr>
+        <w:lastRenderedPageBreak/>
+        <w:t>Simple aggregations</w:t>
+      </w:r>
+    </w:p>
+    <w:p>
+      <w:pPr>
+        <w:jc w:val="both"/>
+        <w:rPr>
+          <w:rFonts w:ascii="Serif" w:hAnsi="Serif"/>
+        </w:rPr>
+      </w:pPr>
+      <w:r>
+        <w:rPr>
+          <w:rFonts w:ascii="Serif" w:hAnsi="Serif"/>
+        </w:rPr>
+        <w:t xml:space="preserve">Simple aggregations were used to analyse trends over time in the </w:t>
+      </w:r>
+      <w:r>
+        <w:rPr>
+          <w:rFonts w:ascii="Serif" w:hAnsi="Serif"/>
+          <w:i/>
+          <w:iCs/>
+        </w:rPr>
+        <w:t>Beef Amazon</w:t>
+      </w:r>
+      <w:r>
+        <w:rPr>
+          <w:rFonts w:ascii="Serif" w:hAnsi="Serif"/>
+        </w:rPr>
+        <w:t xml:space="preserve"> dataset. FOB values show an overall increase, rising from approximately 730 million in 2011 to over 2.7 billion in 2023, indicating significant economic growth. CO₂ net emissions also increased over time, particularly after 2015, reaching values above 120 million. In contrast, emissions are zero in earlier years, suggesting missing or unreported data rather than an actual absence of emissions.</w:t>
+      </w:r>
+    </w:p>
+    <w:p>
+      <w:pPr>
+        <w:rPr>
+          <w:rFonts w:ascii="Serif" w:hAnsi="Serif"/>
+        </w:rPr>
+      </w:pPr>
+    </w:p>
+    <w:p>
+      <w:pPr>
+        <w:rPr>
+          <w:rFonts w:ascii="Serif" w:hAnsi="Serif"/>
+        </w:rPr>
+      </w:pPr>
+      <w:r>
+        <w:rPr>
+          <w:rFonts w:ascii="Serif" w:hAnsi="Serif"/>
+          <w:noProof/>
+          <w:bdr w:val="none" w:sz="0" w:space="0" w:color="auto" w:frame="1"/>
+        </w:rPr>
+        <w:drawing>
+          <wp:anchor distT="0" distB="0" distL="114300" distR="114300" simplePos="0" relativeHeight="251662336" behindDoc="0" locked="0" layoutInCell="1" allowOverlap="1" wp14:anchorId="3CC33D1A" wp14:editId="290BEE6E">
+            <wp:simplePos x="0" y="0"/>
+            <wp:positionH relativeFrom="margin">
+              <wp:align>center</wp:align>
+            </wp:positionH>
+            <wp:positionV relativeFrom="paragraph">
+              <wp:posOffset>58874</wp:posOffset>
+            </wp:positionV>
+            <wp:extent cx="3562350" cy="3638550"/>
+            <wp:effectExtent l="152400" t="114300" r="152400" b="171450"/>
+            <wp:wrapSquare wrapText="bothSides"/>
+            <wp:docPr id="1856840153" name="Picture 15"/>
+            <wp:cNvGraphicFramePr>
+              <a:graphicFrameLocks xmlns:a="http://schemas.openxmlformats.org/drawingml/2006/main" noChangeAspect="1"/>
+            </wp:cNvGraphicFramePr>
+            <a:graphic xmlns:a="http://schemas.openxmlformats.org/drawingml/2006/main">
+              <a:graphicData uri="http://schemas.openxmlformats.org/drawingml/2006/picture">
+                <pic:pic xmlns:pic="http://schemas.openxmlformats.org/drawingml/2006/picture">
+                  <pic:nvPicPr>
+                    <pic:cNvPr id="0" name="Picture 35"/>
+                    <pic:cNvPicPr>
+                      <a:picLocks noChangeAspect="1" noChangeArrowheads="1"/>
+                    </pic:cNvPicPr>
+                  </pic:nvPicPr>
+                  <pic:blipFill>
+                    <a:blip r:embed="rId14">
+                      <a:extLst>
+                        <a:ext uri="{28A0092B-C50C-407E-A947-70E740481C1C}">
+                          <a14:useLocalDpi xmlns:a14="http://schemas.microsoft.com/office/drawing/2010/main" val="0"/>
+                        </a:ext>
+                      </a:extLst>
+                    </a:blip>
+                    <a:srcRect/>
+                    <a:stretch>
+                      <a:fillRect/>
+                    </a:stretch>
+                  </pic:blipFill>
+                  <pic:spPr bwMode="auto">
+                    <a:xfrm>
+                      <a:off x="0" y="0"/>
+                      <a:ext cx="3562350" cy="3638550"/>
+                    </a:xfrm>
+                    <a:prstGeom prst="rect">
+                      <a:avLst/>
+                    </a:prstGeom>
+                    <a:solidFill>
+                      <a:srgbClr val="FFFFFF">
+                        <a:shade val="85000"/>
+                      </a:srgbClr>
+                    </a:solidFill>
+                    <a:ln w="88900" cap="sq">
+                      <a:solidFill>
+                        <a:srgbClr val="FFFFFF"/>
+                      </a:solidFill>
+                      <a:miter lim="800000"/>
+                    </a:ln>
+                    <a:effectLst>
+                      <a:outerShdw blurRad="55000" dist="18000" dir="5400000" algn="tl" rotWithShape="0">
+                        <a:srgbClr val="000000">
+                          <a:alpha val="40000"/>
+                        </a:srgbClr>
+                      </a:outerShdw>
+                    </a:effectLst>
+                    <a:scene3d>
+                      <a:camera prst="orthographicFront"/>
+                      <a:lightRig rig="twoPt" dir="t">
+                        <a:rot lat="0" lon="0" rev="7200000"/>
+                      </a:lightRig>
+                    </a:scene3d>
+                    <a:sp3d>
+                      <a:bevelT w="25400" h="19050"/>
+                      <a:contourClr>
+                        <a:srgbClr val="FFFFFF"/>
+                      </a:contourClr>
+                    </a:sp3d>
+                  </pic:spPr>
+                </pic:pic>
+              </a:graphicData>
+            </a:graphic>
+            <wp14:sizeRelH relativeFrom="page">
+              <wp14:pctWidth>0</wp14:pctWidth>
+            </wp14:sizeRelH>
+            <wp14:sizeRelV relativeFrom="page">
+              <wp14:pctHeight>0</wp14:pctHeight>
+            </wp14:sizeRelV>
+          </wp:anchor>
+        </w:drawing>
+      </w:r>
+    </w:p>
+    <w:p>
+      <w:pPr>
+        <w:rPr>
+          <w:rFonts w:ascii="Serif" w:hAnsi="Serif"/>
+        </w:rPr>
+      </w:pPr>
+    </w:p>
+    <w:p>
+      <w:pPr>
+        <w:rPr>
+          <w:rFonts w:ascii="Serif" w:hAnsi="Serif"/>
+        </w:rPr>
+      </w:pPr>
+    </w:p>
+    <w:p>
+      <w:pPr>
+        <w:rPr>
+          <w:rFonts w:ascii="Serif" w:hAnsi="Serif"/>
+        </w:rPr>
+      </w:pPr>
+    </w:p>
+    <w:p>
+      <w:pPr>
+        <w:rPr>
+          <w:rFonts w:ascii="Serif" w:hAnsi="Serif"/>
+        </w:rPr>
+      </w:pPr>
+    </w:p>
+    <w:p>
+      <w:pPr>
+        <w:rPr>
+          <w:rFonts w:ascii="Serif" w:hAnsi="Serif"/>
+        </w:rPr>
+      </w:pPr>
+    </w:p>
+    <w:p>
+      <w:pPr>
+        <w:rPr>
+          <w:rFonts w:ascii="Serif" w:hAnsi="Serif"/>
+        </w:rPr>
+      </w:pPr>
+    </w:p>
+    <w:p>
+      <w:pPr>
+        <w:rPr>
+          <w:rFonts w:ascii="Serif" w:hAnsi="Serif"/>
+        </w:rPr>
+      </w:pPr>
+    </w:p>
+    <w:p>
+      <w:pPr>
+        <w:rPr>
+          <w:rFonts w:ascii="Serif" w:hAnsi="Serif"/>
+        </w:rPr>
+      </w:pPr>
+    </w:p>
+    <w:p>
+      <w:pPr>
+        <w:rPr>
+          <w:rFonts w:ascii="Serif" w:hAnsi="Serif"/>
+        </w:rPr>
+      </w:pPr>
+    </w:p>
+    <w:p>
+      <w:pPr>
+        <w:rPr>
+          <w:rFonts w:ascii="Serif" w:hAnsi="Serif"/>
+        </w:rPr>
+      </w:pPr>
+    </w:p>
+    <w:p>
+      <w:pPr>
+        <w:rPr>
+          <w:rFonts w:ascii="Serif" w:hAnsi="Serif"/>
+        </w:rPr>
+      </w:pPr>
+    </w:p>
+    <w:p>
+      <w:pPr>
+        <w:rPr>
+          <w:rFonts w:ascii="Serif" w:hAnsi="Serif"/>
+        </w:rPr>
+      </w:pPr>
+    </w:p>
+    <w:p>
+      <w:pPr>
+        <w:rPr>
+          <w:rFonts w:ascii="Serif" w:hAnsi="Serif"/>
+        </w:rPr>
+      </w:pPr>
+    </w:p>
+    <w:p>
+      <w:pPr>
+        <w:rPr>
+          <w:rFonts w:ascii="Serif" w:hAnsi="Serif"/>
+        </w:rPr>
+      </w:pPr>
+    </w:p>
+    <w:p>
+      <w:pPr>
+        <w:rPr>
+          <w:rFonts w:ascii="Serif" w:hAnsi="Serif"/>
+        </w:rPr>
+      </w:pPr>
+    </w:p>
+    <w:p>
+      <w:pPr>
+        <w:rPr>
+          <w:rFonts w:ascii="Serif" w:hAnsi="Serif"/>
+        </w:rPr>
+      </w:pPr>
+    </w:p>
+    <w:p>
+      <w:pPr>
+        <w:rPr>
+          <w:rFonts w:ascii="Serif" w:hAnsi="Serif"/>
+        </w:rPr>
+      </w:pPr>
+    </w:p>
+    <w:p>
+      <w:pPr>
+        <w:rPr>
+          <w:rFonts w:ascii="Serif" w:hAnsi="Serif"/>
+        </w:rPr>
+      </w:pPr>
+    </w:p>
+    <w:p>
+      <w:pPr>
+        <w:rPr>
+          <w:rFonts w:ascii="Serif" w:hAnsi="Serif"/>
+        </w:rPr>
+      </w:pPr>
+    </w:p>
+    <w:p>
+      <w:pPr>
+        <w:rPr>
+          <w:rFonts w:ascii="Serif" w:hAnsi="Serif"/>
+        </w:rPr>
+      </w:pPr>
+    </w:p>
+    <w:p>
+      <w:pPr>
+        <w:pStyle w:val="Heading2"/>
+        <w:rPr>
+          <w:rFonts w:ascii="Serif" w:hAnsi="Serif"/>
+        </w:rPr>
+      </w:pPr>
+      <w:bookmarkStart w:id="25" w:name="_Toc229330726"/>
+      <w:r>
+        <w:rPr>
+          <w:rFonts w:ascii="Serif" w:hAnsi="Serif"/>
+        </w:rPr>
+        <w:lastRenderedPageBreak/>
+        <w:t>2.4 Data Quality Report</w:t>
+      </w:r>
+      <w:bookmarkEnd w:id="25"/>
+    </w:p>
+    <w:p>
+      <w:pPr>
+        <w:pStyle w:val="Heading4"/>
+        <w:rPr>
+          <w:rFonts w:ascii="Serif" w:hAnsi="Serif"/>
+          <w:b/>
+          <w:bCs/>
+          <w:i w:val="0"/>
+          <w:iCs w:val="0"/>
+          <w:color w:val="000000" w:themeColor="text1"/>
+        </w:rPr>
+      </w:pPr>
+      <w:r>
+        <w:rPr>
+          <w:rFonts w:ascii="Serif" w:hAnsi="Serif"/>
+          <w:b/>
+          <w:bCs/>
+          <w:i w:val="0"/>
+          <w:iCs w:val="0"/>
+          <w:color w:val="000000" w:themeColor="text1"/>
+        </w:rPr>
+        <w:t>Missing values</w:t>
+      </w:r>
+    </w:p>
+    <w:p>
+      <w:pPr>
+        <w:pStyle w:val="Heading4"/>
+        <w:jc w:val="both"/>
+        <w:rPr>
+          <w:rFonts w:ascii="Serif" w:eastAsiaTheme="minorHAnsi" w:hAnsi="Serif" w:cstheme="minorBidi"/>
+          <w:i w:val="0"/>
+          <w:iCs w:val="0"/>
+          <w:color w:val="auto"/>
+        </w:rPr>
+      </w:pPr>
+      <w:r>
+        <w:rPr>
+          <w:rFonts w:ascii="Serif" w:eastAsiaTheme="minorHAnsi" w:hAnsi="Serif" w:cstheme="minorBidi"/>
+          <w:i w:val="0"/>
+          <w:iCs w:val="0"/>
+          <w:color w:val="auto"/>
+        </w:rPr>
+        <w:t>During the analysis, we identified that four features contain missing values. The land use variable has approximately 3.75% missing data, which is relatively low and unlikely to significantly impact the analysis. On the other hand, the variables related to deforestation exposure and CO₂ emissions contain a much higher proportion of 24.92% missing values, which may negatively affect the reliability of the results and should be carefully handled in later stages.</w:t>
+      </w:r>
+    </w:p>
+    <w:p>
+      <w:pPr>
+        <w:pStyle w:val="Heading4"/>
+        <w:rPr>
+          <w:rFonts w:ascii="Serif" w:hAnsi="Serif"/>
+          <w:b/>
+          <w:bCs/>
+          <w:i w:val="0"/>
+          <w:iCs w:val="0"/>
+          <w:color w:val="000000" w:themeColor="text1"/>
+        </w:rPr>
+      </w:pPr>
+      <w:r>
+        <w:rPr>
+          <w:rFonts w:ascii="Serif" w:hAnsi="Serif"/>
+          <w:b/>
+          <w:bCs/>
+          <w:i w:val="0"/>
+          <w:iCs w:val="0"/>
+          <w:color w:val="000000" w:themeColor="text1"/>
+        </w:rPr>
+        <w:t>Outliers</w:t>
+      </w:r>
+    </w:p>
+    <w:p>
+      <w:pPr>
+        <w:pStyle w:val="Heading4"/>
+        <w:jc w:val="both"/>
+        <w:rPr>
+          <w:rFonts w:ascii="Serif" w:eastAsiaTheme="minorHAnsi" w:hAnsi="Serif" w:cstheme="minorBidi"/>
+          <w:i w:val="0"/>
+          <w:iCs w:val="0"/>
+          <w:color w:val="auto"/>
+        </w:rPr>
+      </w:pPr>
+      <w:r>
+        <w:rPr>
+          <w:rFonts w:ascii="Serif" w:eastAsiaTheme="minorHAnsi" w:hAnsi="Serif" w:cstheme="minorBidi"/>
+          <w:i w:val="0"/>
+          <w:iCs w:val="0"/>
+          <w:color w:val="auto"/>
+        </w:rPr>
+        <w:t>From our analysis, we observed that the dataset contains significant outliers, with most values concentrated near zero and a few extreme values in variables such as FOB and CO₂ emissions. These outliers contribute to strong skewness and may affect data interpretation and model performance.</w:t>
+      </w:r>
+    </w:p>
+    <w:p>
+      <w:pPr>
+        <w:pStyle w:val="Heading4"/>
+        <w:jc w:val="both"/>
+        <w:rPr>
+          <w:rFonts w:ascii="Serif" w:hAnsi="Serif"/>
+          <w:b/>
+          <w:bCs/>
+          <w:i w:val="0"/>
+          <w:iCs w:val="0"/>
+          <w:color w:val="000000" w:themeColor="text1"/>
+        </w:rPr>
+      </w:pPr>
+      <w:r>
+        <w:rPr>
+          <w:rFonts w:ascii="Serif" w:hAnsi="Serif"/>
+          <w:b/>
+          <w:bCs/>
+          <w:i w:val="0"/>
+          <w:iCs w:val="0"/>
+          <w:color w:val="000000" w:themeColor="text1"/>
+        </w:rPr>
+        <w:t xml:space="preserve">Duplicates </w:t>
+      </w:r>
+    </w:p>
+    <w:p>
+      <w:pPr>
+        <w:pStyle w:val="Heading4"/>
+        <w:jc w:val="both"/>
+        <w:rPr>
+          <w:rFonts w:ascii="Serif" w:eastAsiaTheme="minorHAnsi" w:hAnsi="Serif" w:cstheme="minorBidi"/>
+          <w:i w:val="0"/>
+          <w:iCs w:val="0"/>
+          <w:color w:val="auto"/>
+        </w:rPr>
+      </w:pPr>
+      <w:r>
+        <w:rPr>
+          <w:rFonts w:ascii="Serif" w:eastAsiaTheme="minorHAnsi" w:hAnsi="Serif" w:cstheme="minorBidi"/>
+          <w:i w:val="0"/>
+          <w:iCs w:val="0"/>
+          <w:color w:val="auto"/>
+        </w:rPr>
+        <w:t>We also examined the dataset for duplicate records and found no significant duplicates. This indicates that each observation represents a unique entry, ensuring data integrity and consistency. The absence of duplicates is important, as it prevents bias caused by repeated records and ensures that the analysis and model training are based on accurate and non-redundant data.</w:t>
+      </w:r>
+    </w:p>
+    <w:p>
+      <w:pPr>
+        <w:pStyle w:val="Heading4"/>
+        <w:rPr>
+          <w:rFonts w:ascii="Serif" w:hAnsi="Serif"/>
+          <w:b/>
+          <w:bCs/>
+          <w:i w:val="0"/>
+          <w:iCs w:val="0"/>
+        </w:rPr>
+      </w:pPr>
+      <w:r>
+        <w:rPr>
+          <w:rFonts w:ascii="Serif" w:hAnsi="Serif"/>
+          <w:b/>
+          <w:bCs/>
+          <w:i w:val="0"/>
+          <w:iCs w:val="0"/>
+          <w:color w:val="000000" w:themeColor="text1"/>
+        </w:rPr>
+        <w:t>Possible solutions</w:t>
+      </w:r>
+    </w:p>
+    <w:p>
+      <w:pPr>
+        <w:jc w:val="both"/>
+        <w:rPr>
+          <w:rFonts w:ascii="Serif" w:hAnsi="Serif"/>
+        </w:rPr>
+      </w:pPr>
+      <w:r>
+        <w:rPr>
+          <w:rFonts w:ascii="Serif" w:hAnsi="Serif"/>
+        </w:rPr>
+        <w:t>To address the identified data quality issues, we considered several approaches. Missing values may be handled using imputation techniques, including simple methods such as median imputation, as well as model-based imputation to better estimate missing values and reduce bias. Alternatively, the removal of rows with missing values may be considered, depending on their impact on the dataset.</w:t>
+      </w:r>
+    </w:p>
+    <w:p>
+      <w:pPr>
+        <w:jc w:val="both"/>
+        <w:rPr>
+          <w:rFonts w:ascii="Serif" w:hAnsi="Serif"/>
+        </w:rPr>
+      </w:pPr>
+      <w:r>
+        <w:rPr>
+          <w:rFonts w:ascii="Serif" w:hAnsi="Serif"/>
+        </w:rPr>
+        <w:t>Regarding outliers, we decided that these values should be kept, as they represent real observations and may provide valuable insights. However, their impact on model performance should be considered, and techniques such as feature scaling may be applied depending on the requirements of the selected machine learning models.</w:t>
+      </w:r>
+    </w:p>
+    <w:p>
+      <w:pPr>
+        <w:jc w:val="both"/>
+        <w:rPr>
+          <w:rFonts w:ascii="Serif" w:hAnsi="Serif"/>
+        </w:rPr>
+      </w:pPr>
+    </w:p>
     <w:p/>
     <w:p/>
     <w:p/>
     <w:p/>
     <w:p/>
     <w:sectPr>
-      <w:headerReference w:type="default" r:id="rId8"/>
-      <w:footerReference w:type="default" r:id="rId9"/>
+      <w:headerReference w:type="default" r:id="rId15"/>
+      <w:footerReference w:type="default" r:id="rId16"/>
       <w:pgSz w:w="11906" w:h="16838"/>
       <w:pgMar w:top="1418" w:right="1440" w:bottom="1440" w:left="1440" w:header="709" w:footer="709" w:gutter="0"/>
       <w:cols w:space="708"/>
@@ -2057,6 +3781,7 @@
                             <w:dataBinding w:prefixMappings="xmlns:ns0='http://purl.org/dc/elements/1.1/' xmlns:ns1='http://schemas.openxmlformats.org/package/2006/metadata/core-properties' " w:xpath="/ns1:coreProperties[1]/ns0:title[1]" w:storeItemID="{6C3C8BC8-F283-45AE-878A-BAB7291924A1}"/>
                             <w:text/>
                           </w:sdtPr>
+                          <w:sdtEndPr/>
                           <w:sdtContent>
                             <w:p>
                               <w:pPr>
@@ -2122,6 +3847,7 @@
                       <w:dataBinding w:prefixMappings="xmlns:ns0='http://purl.org/dc/elements/1.1/' xmlns:ns1='http://schemas.openxmlformats.org/package/2006/metadata/core-properties' " w:xpath="/ns1:coreProperties[1]/ns0:title[1]" w:storeItemID="{6C3C8BC8-F283-45AE-878A-BAB7291924A1}"/>
                       <w:text/>
                     </w:sdtPr>
+                    <w:sdtEndPr/>
                     <w:sdtContent>
                       <w:p>
                         <w:pPr>
@@ -3169,7 +4895,6 @@
     <w:next w:val="Normal"/>
     <w:link w:val="Heading4Char"/>
     <w:uiPriority w:val="9"/>
-    <w:semiHidden/>
     <w:unhideWhenUsed/>
     <w:qFormat/>
     <w:rsid w:val="0055158C"/>
@@ -3368,7 +5093,6 @@
     <w:basedOn w:val="DefaultParagraphFont"/>
     <w:link w:val="Heading4"/>
     <w:uiPriority w:val="9"/>
-    <w:semiHidden/>
     <w:rsid w:val="0055158C"/>
     <w:rPr>
       <w:rFonts w:eastAsiaTheme="majorEastAsia" w:cstheme="majorBidi"/>

</xml_diff>

<commit_message>
Created a graph to compared the models
-used a simple graph to compare the model evaluation
</commit_message>
<xml_diff>
--- a/Final_Project_Carlos_Suelen.docx
+++ b/Final_Project_Carlos_Suelen.docx
@@ -57,7 +57,25 @@
           <w:sz w:val="28"/>
           <w:szCs w:val="28"/>
         </w:rPr>
-        <w:t>Carlos Daniel Ambrosio &amp; Suelen Rocha</w:t>
+        <w:t xml:space="preserve">Carlos Daniel Ambrosio &amp; </w:t>
+      </w:r>
+      <w:proofErr w:type="spellStart"/>
+      <w:r>
+        <w:rPr>
+          <w:rFonts w:ascii="Serif" w:hAnsi="Serif" w:cs="Arial"/>
+          <w:sz w:val="28"/>
+          <w:szCs w:val="28"/>
+        </w:rPr>
+        <w:t>Suelen</w:t>
+      </w:r>
+      <w:proofErr w:type="spellEnd"/>
+      <w:r>
+        <w:rPr>
+          <w:rFonts w:ascii="Serif" w:hAnsi="Serif" w:cs="Arial"/>
+          <w:sz w:val="28"/>
+          <w:szCs w:val="28"/>
+        </w:rPr>
+        <w:t xml:space="preserve"> Rocha</w:t>
       </w:r>
     </w:p>
     <w:p>
@@ -1035,7 +1053,21 @@
         <w:rPr>
           <w:rFonts w:ascii="Serif" w:hAnsi="Serif" w:cs="Arial"/>
         </w:rPr>
-        <w:t>Deforestation has become a major environmental issue worldwide, especially in the Amazon Rainforest, which is known as one of the world’s largest carbon sinks. This region has been significantly impacted by cattle farming, contributing to increased CO₂ emissions and land degradation. As Brazil is one of the world’s largest beef producers and exporters, the environmental impact of livestock production has attracted increasing attention from organisations, governments, and sustainability analysts.</w:t>
+        <w:t xml:space="preserve">Deforestation has become a major environmental issue worldwide, especially in the Amazon Rainforest, which is known as one of the world’s largest carbon sinks. This region has been significantly impacted by cattle farming, contributing to increased CO₂ emissions and land degradation. As Brazil is one of the world’s largest beef producers and exporters, the environmental impact of livestock production has attracted increasing attention from </w:t>
+      </w:r>
+      <w:proofErr w:type="spellStart"/>
+      <w:r>
+        <w:rPr>
+          <w:rFonts w:ascii="Serif" w:hAnsi="Serif" w:cs="Arial"/>
+        </w:rPr>
+        <w:t>organisations</w:t>
+      </w:r>
+      <w:proofErr w:type="spellEnd"/>
+      <w:r>
+        <w:rPr>
+          <w:rFonts w:ascii="Serif" w:hAnsi="Serif" w:cs="Arial"/>
+        </w:rPr>
+        <w:t>, governments, and sustainability analysts.</w:t>
       </w:r>
     </w:p>
     <w:p>
@@ -1049,7 +1081,21 @@
         <w:rPr>
           <w:rFonts w:ascii="Serif" w:hAnsi="Serif" w:cs="Arial"/>
         </w:rPr>
-        <w:t>This project aims to analyse the relationship between cattle farming, deforestation, and CO₂ emissions in the Amazon using Machine Learning techniques. Using the CRISP-DM framework, the project explored each stage of the process, starting with business understanding, followed by data understanding, data preparation, modelling, evaluation, and deployment.</w:t>
+        <w:t xml:space="preserve">This project aims to </w:t>
+      </w:r>
+      <w:proofErr w:type="spellStart"/>
+      <w:r>
+        <w:rPr>
+          <w:rFonts w:ascii="Serif" w:hAnsi="Serif" w:cs="Arial"/>
+        </w:rPr>
+        <w:t>analyse</w:t>
+      </w:r>
+      <w:proofErr w:type="spellEnd"/>
+      <w:r>
+        <w:rPr>
+          <w:rFonts w:ascii="Serif" w:hAnsi="Serif" w:cs="Arial"/>
+        </w:rPr>
+        <w:t xml:space="preserve"> the relationship between cattle farming, deforestation, and CO₂ emissions in the Amazon using Machine Learning techniques. Using the CRISP-DM framework, the project explored each stage of the process, starting with business understanding, followed by data understanding, data preparation, modelling, evaluation, and deployment.</w:t>
       </w:r>
     </w:p>
     <w:p>
@@ -1063,7 +1109,21 @@
         <w:rPr>
           <w:rFonts w:ascii="Serif" w:hAnsi="Serif" w:cs="Arial"/>
         </w:rPr>
-        <w:t>During the exploratory data analysis phase, the dataset was analysed using histograms, scatter plots, boxplots, and correlation analysis to better understand the distribution of the variables, identify outliers, examine relationships between features, and detect issues such as skewness and multicollinearity. The analysis showed that the dataset contains highly skewed distributions, extreme values, correlated variables, and missing data, which required careful preprocessing before modelling.</w:t>
+        <w:t xml:space="preserve">During the exploratory data analysis phase, the dataset was </w:t>
+      </w:r>
+      <w:proofErr w:type="spellStart"/>
+      <w:r>
+        <w:rPr>
+          <w:rFonts w:ascii="Serif" w:hAnsi="Serif" w:cs="Arial"/>
+        </w:rPr>
+        <w:t>analysed</w:t>
+      </w:r>
+      <w:proofErr w:type="spellEnd"/>
+      <w:r>
+        <w:rPr>
+          <w:rFonts w:ascii="Serif" w:hAnsi="Serif" w:cs="Arial"/>
+        </w:rPr>
+        <w:t xml:space="preserve"> using histograms, scatter plots, boxplots, and correlation analysis to better understand the distribution of the variables, identify outliers, examine relationships between features, and detect issues such as skewness and multicollinearity. The analysis showed that the dataset contains highly skewed distributions, extreme values, correlated variables, and missing data, which required careful preprocessing before modelling.</w:t>
       </w:r>
     </w:p>
     <w:p>
@@ -1097,7 +1157,21 @@
         <w:rPr>
           <w:rFonts w:ascii="Serif" w:hAnsi="Serif" w:cs="Arial"/>
         </w:rPr>
-        <w:t xml:space="preserve"> machine learning models were developed and compared: K-Nearest Neighbours Regressor (KNN), Random Forest Regressor, Partial Least Squares Regressor (PLS)</w:t>
+        <w:t xml:space="preserve"> machine learning models were developed and compared: K-Nearest </w:t>
+      </w:r>
+      <w:proofErr w:type="spellStart"/>
+      <w:r>
+        <w:rPr>
+          <w:rFonts w:ascii="Serif" w:hAnsi="Serif" w:cs="Arial"/>
+        </w:rPr>
+        <w:t>Neighbours</w:t>
+      </w:r>
+      <w:proofErr w:type="spellEnd"/>
+      <w:r>
+        <w:rPr>
+          <w:rFonts w:ascii="Serif" w:hAnsi="Serif" w:cs="Arial"/>
+        </w:rPr>
+        <w:t xml:space="preserve"> Regressor (KNN), Random Forest Regressor, Partial Least Squares Regressor (PLS)</w:t>
       </w:r>
       <w:r>
         <w:rPr>
@@ -1121,7 +1195,49 @@
         <w:rPr>
           <w:rFonts w:ascii="Serif" w:hAnsi="Serif" w:cs="Arial"/>
         </w:rPr>
-        <w:t>Different hyperparameters were tested using GridSearchCV, and the models were evaluated using metrics such as R² score, Mean Absolute Error (MAE), and cross-validation. Particular attention was given to how correlated features and preprocessing techniques affected model performance and generalisation.</w:t>
+        <w:t xml:space="preserve">Different hyperparameters were tested using </w:t>
+      </w:r>
+      <w:proofErr w:type="spellStart"/>
+      <w:r>
+        <w:rPr>
+          <w:rFonts w:ascii="Serif" w:hAnsi="Serif" w:cs="Arial"/>
+        </w:rPr>
+        <w:t>GridSearchCV</w:t>
+      </w:r>
+      <w:proofErr w:type="spellEnd"/>
+      <w:r>
+        <w:rPr>
+          <w:rFonts w:ascii="Serif" w:hAnsi="Serif" w:cs="Arial"/>
+        </w:rPr>
+        <w:t xml:space="preserve">, and the models were evaluated using metrics such as R² score, Mean Absolute Error (MAE), and cross-validation. </w:t>
+      </w:r>
+      <w:proofErr w:type="gramStart"/>
+      <w:r>
+        <w:rPr>
+          <w:rFonts w:ascii="Serif" w:hAnsi="Serif" w:cs="Arial"/>
+        </w:rPr>
+        <w:t>Particular attention</w:t>
+      </w:r>
+      <w:proofErr w:type="gramEnd"/>
+      <w:r>
+        <w:rPr>
+          <w:rFonts w:ascii="Serif" w:hAnsi="Serif" w:cs="Arial"/>
+        </w:rPr>
+        <w:t xml:space="preserve"> was given to how correlated features and preprocessing techniques affected model performance and </w:t>
+      </w:r>
+      <w:proofErr w:type="spellStart"/>
+      <w:r>
+        <w:rPr>
+          <w:rFonts w:ascii="Serif" w:hAnsi="Serif" w:cs="Arial"/>
+        </w:rPr>
+        <w:t>generalisation</w:t>
+      </w:r>
+      <w:proofErr w:type="spellEnd"/>
+      <w:r>
+        <w:rPr>
+          <w:rFonts w:ascii="Serif" w:hAnsi="Serif" w:cs="Arial"/>
+        </w:rPr>
+        <w:t>.</w:t>
       </w:r>
     </w:p>
     <w:p>
@@ -1261,7 +1377,21 @@
         <w:rPr>
           <w:rFonts w:ascii="Serif" w:hAnsi="Serif" w:cs="Arial"/>
         </w:rPr>
-        <w:t>This project aims to analyse livestock farming, Amazon deforestation, and CO</w:t>
+        <w:t xml:space="preserve">This project aims to </w:t>
+      </w:r>
+      <w:proofErr w:type="spellStart"/>
+      <w:r>
+        <w:rPr>
+          <w:rFonts w:ascii="Serif" w:hAnsi="Serif" w:cs="Arial"/>
+        </w:rPr>
+        <w:t>analyse</w:t>
+      </w:r>
+      <w:proofErr w:type="spellEnd"/>
+      <w:r>
+        <w:rPr>
+          <w:rFonts w:ascii="Serif" w:hAnsi="Serif" w:cs="Arial"/>
+        </w:rPr>
+        <w:t xml:space="preserve"> livestock farming, Amazon deforestation, and CO</w:t>
       </w:r>
       <w:r>
         <w:rPr>
@@ -1301,7 +1431,21 @@
         <w:rPr>
           <w:rFonts w:ascii="Serif" w:hAnsi="Serif" w:cs="Arial"/>
         </w:rPr>
-        <w:t>The Amazon Rainforest is the largest tropical forest and one of the most biodiverse ecosystems. It plays a vital role in absorbing around 200+ billion tons of carbon, regulating the climate, and maintaining global rainfall patterns. (WWF, 2024). Due to deforestation in the Amazon, driven by activities such as livestock farming, mining, and soy production, the region is experiencing significant carbon loss. In particular, meat production contributes heavily to this impact, leading to substantial CO</w:t>
+        <w:t xml:space="preserve">The Amazon Rainforest is the largest tropical forest and one of the most biodiverse ecosystems. It plays a vital role in absorbing around 200+ billion tons of carbon, regulating the climate, and maintaining global rainfall patterns. (WWF, 2024). Due to deforestation in the Amazon, driven by activities such as livestock farming, mining, and soy production, the region is experiencing significant carbon loss. </w:t>
+      </w:r>
+      <w:proofErr w:type="gramStart"/>
+      <w:r>
+        <w:rPr>
+          <w:rFonts w:ascii="Serif" w:hAnsi="Serif" w:cs="Arial"/>
+        </w:rPr>
+        <w:t>In particular, meat</w:t>
+      </w:r>
+      <w:proofErr w:type="gramEnd"/>
+      <w:r>
+        <w:rPr>
+          <w:rFonts w:ascii="Serif" w:hAnsi="Serif" w:cs="Arial"/>
+        </w:rPr>
+        <w:t xml:space="preserve"> production contributes heavily to this impact, leading to substantial CO</w:t>
       </w:r>
       <w:r>
         <w:rPr>
@@ -1396,7 +1540,21 @@
         <w:rPr>
           <w:rFonts w:ascii="Serif" w:hAnsi="Serif" w:cs="Arial"/>
         </w:rPr>
-        <w:t>Can predictive models help organisations anticipate environmental risks?</w:t>
+        <w:t xml:space="preserve">Can predictive models help </w:t>
+      </w:r>
+      <w:proofErr w:type="spellStart"/>
+      <w:r>
+        <w:rPr>
+          <w:rFonts w:ascii="Serif" w:hAnsi="Serif" w:cs="Arial"/>
+        </w:rPr>
+        <w:t>organisations</w:t>
+      </w:r>
+      <w:proofErr w:type="spellEnd"/>
+      <w:r>
+        <w:rPr>
+          <w:rFonts w:ascii="Serif" w:hAnsi="Serif" w:cs="Arial"/>
+        </w:rPr>
+        <w:t xml:space="preserve"> anticipate environmental risks?</w:t>
       </w:r>
     </w:p>
     <w:p>
@@ -1576,7 +1734,21 @@
         <w:rPr>
           <w:rFonts w:ascii="Serif" w:hAnsi="Serif" w:cs="Arial"/>
         </w:rPr>
-        <w:t>Data Understanding: Data collection from TerraBrasilis, TRASE, and INPE</w:t>
+        <w:t xml:space="preserve">Data Understanding: Data collection from </w:t>
+      </w:r>
+      <w:proofErr w:type="spellStart"/>
+      <w:r>
+        <w:rPr>
+          <w:rFonts w:ascii="Serif" w:hAnsi="Serif" w:cs="Arial"/>
+        </w:rPr>
+        <w:t>TerraBrasilis</w:t>
+      </w:r>
+      <w:proofErr w:type="spellEnd"/>
+      <w:r>
+        <w:rPr>
+          <w:rFonts w:ascii="Serif" w:hAnsi="Serif" w:cs="Arial"/>
+        </w:rPr>
+        <w:t>, TRASE, and INPE</w:t>
       </w:r>
     </w:p>
     <w:p>
@@ -1703,11 +1875,19 @@
           <w:rFonts w:ascii="Serif" w:hAnsi="Serif" w:cs="Arial"/>
         </w:rPr>
       </w:pPr>
-      <w:r>
-        <w:rPr>
-          <w:rFonts w:ascii="Serif" w:hAnsi="Serif" w:cs="Arial"/>
-        </w:rPr>
-        <w:t>Jupyter Notebook, Python</w:t>
+      <w:proofErr w:type="spellStart"/>
+      <w:r>
+        <w:rPr>
+          <w:rFonts w:ascii="Serif" w:hAnsi="Serif" w:cs="Arial"/>
+        </w:rPr>
+        <w:t>Jupyter</w:t>
+      </w:r>
+      <w:proofErr w:type="spellEnd"/>
+      <w:r>
+        <w:rPr>
+          <w:rFonts w:ascii="Serif" w:hAnsi="Serif" w:cs="Arial"/>
+        </w:rPr>
+        <w:t xml:space="preserve"> Notebook, Python</w:t>
       </w:r>
     </w:p>
     <w:p>
@@ -1738,7 +1918,35 @@
         <w:rPr>
           <w:rFonts w:ascii="Serif" w:hAnsi="Serif" w:cs="Arial"/>
         </w:rPr>
-        <w:t>, seaborn, plotly, geopandas)</w:t>
+        <w:t xml:space="preserve">, seaborn, </w:t>
+      </w:r>
+      <w:proofErr w:type="spellStart"/>
+      <w:r>
+        <w:rPr>
+          <w:rFonts w:ascii="Serif" w:hAnsi="Serif" w:cs="Arial"/>
+        </w:rPr>
+        <w:t>plotly</w:t>
+      </w:r>
+      <w:proofErr w:type="spellEnd"/>
+      <w:r>
+        <w:rPr>
+          <w:rFonts w:ascii="Serif" w:hAnsi="Serif" w:cs="Arial"/>
+        </w:rPr>
+        <w:t xml:space="preserve">, </w:t>
+      </w:r>
+      <w:proofErr w:type="spellStart"/>
+      <w:r>
+        <w:rPr>
+          <w:rFonts w:ascii="Serif" w:hAnsi="Serif" w:cs="Arial"/>
+        </w:rPr>
+        <w:t>geopandas</w:t>
+      </w:r>
+      <w:proofErr w:type="spellEnd"/>
+      <w:r>
+        <w:rPr>
+          <w:rFonts w:ascii="Serif" w:hAnsi="Serif" w:cs="Arial"/>
+        </w:rPr>
+        <w:t>)</w:t>
       </w:r>
     </w:p>
     <w:p>
@@ -1760,12 +1968,14 @@
         </w:rPr>
         <w:t xml:space="preserve">Machine Learning (Linear Regression, K-Nearest </w:t>
       </w:r>
+      <w:proofErr w:type="spellStart"/>
       <w:r>
         <w:rPr>
           <w:rFonts w:ascii="Serif" w:hAnsi="Serif" w:cs="Arial"/>
         </w:rPr>
         <w:t>Neighbour</w:t>
       </w:r>
+      <w:proofErr w:type="spellEnd"/>
       <w:r>
         <w:rPr>
           <w:rFonts w:ascii="Serif" w:hAnsi="Serif" w:cs="Arial"/>
@@ -1868,7 +2078,21 @@
         <w:rPr>
           <w:rFonts w:ascii="Serif" w:hAnsi="Serif" w:cs="Arial"/>
         </w:rPr>
-        <w:t xml:space="preserve"> useful insights for policymakers, ESG analysts, and organisations, </w:t>
+        <w:t xml:space="preserve"> useful insights for policymakers, ESG analysts, and </w:t>
+      </w:r>
+      <w:proofErr w:type="spellStart"/>
+      <w:r>
+        <w:rPr>
+          <w:rFonts w:ascii="Serif" w:hAnsi="Serif" w:cs="Arial"/>
+        </w:rPr>
+        <w:t>organisations</w:t>
+      </w:r>
+      <w:proofErr w:type="spellEnd"/>
+      <w:r>
+        <w:rPr>
+          <w:rFonts w:ascii="Serif" w:hAnsi="Serif" w:cs="Arial"/>
+        </w:rPr>
+        <w:t xml:space="preserve">, </w:t>
       </w:r>
       <w:r>
         <w:rPr>
@@ -1984,14 +2208,70 @@
         <w:rPr>
           <w:rFonts w:ascii="Serif" w:hAnsi="Serif" w:cs="Arial"/>
         </w:rPr>
-        <w:t xml:space="preserve"> emissions linked to cattle-driven deforestation. By analysing these emissions, the system helps organisations understand risks and make more informed decisions about their supply chains and sustainability strategies. This solution would help organisations identify risks earlier, stay aligned with regulations and market expectations, and avoid penalties or trade restrictions while protecting their reputation. Businesses can improve sustainability </w:t>
+        <w:t xml:space="preserve"> emissions linked to cattle-driven deforestation. By </w:t>
+      </w:r>
+      <w:proofErr w:type="spellStart"/>
+      <w:r>
+        <w:rPr>
+          <w:rFonts w:ascii="Serif" w:hAnsi="Serif" w:cs="Arial"/>
+        </w:rPr>
+        <w:t>analysing</w:t>
+      </w:r>
+      <w:proofErr w:type="spellEnd"/>
+      <w:r>
+        <w:rPr>
+          <w:rFonts w:ascii="Serif" w:hAnsi="Serif" w:cs="Arial"/>
+        </w:rPr>
+        <w:t xml:space="preserve"> these emissions, the system helps </w:t>
+      </w:r>
+      <w:proofErr w:type="spellStart"/>
+      <w:r>
+        <w:rPr>
+          <w:rFonts w:ascii="Serif" w:hAnsi="Serif" w:cs="Arial"/>
+        </w:rPr>
+        <w:t>organisations</w:t>
+      </w:r>
+      <w:proofErr w:type="spellEnd"/>
+      <w:r>
+        <w:rPr>
+          <w:rFonts w:ascii="Serif" w:hAnsi="Serif" w:cs="Arial"/>
+        </w:rPr>
+        <w:t xml:space="preserve"> understand risks and make more informed decisions about their supply chains and sustainability strategies. This solution would help </w:t>
+      </w:r>
+      <w:proofErr w:type="spellStart"/>
+      <w:r>
+        <w:rPr>
+          <w:rFonts w:ascii="Serif" w:hAnsi="Serif" w:cs="Arial"/>
+        </w:rPr>
+        <w:t>organisations</w:t>
+      </w:r>
+      <w:proofErr w:type="spellEnd"/>
+      <w:r>
+        <w:rPr>
+          <w:rFonts w:ascii="Serif" w:hAnsi="Serif" w:cs="Arial"/>
+        </w:rPr>
+        <w:t xml:space="preserve"> identify risks earlier, stay aligned with regulations and market expectations, and avoid penalties or trade restrictions while protecting their reputation. Businesses can improve sustainability </w:t>
       </w:r>
       <w:r>
         <w:rPr>
           <w:rFonts w:ascii="Serif" w:hAnsi="Serif" w:cs="Arial"/>
         </w:rPr>
         <w:lastRenderedPageBreak/>
-        <w:t>reporting, demonstrate responsible practices to investors and regulators, and maintain access to international markets while reducing compliance costs. (Aljohani, 2023)</w:t>
+        <w:t>reporting, demonstrate responsible practices to investors and regulators, and maintain access to international markets while reducing compliance costs. (</w:t>
+      </w:r>
+      <w:proofErr w:type="spellStart"/>
+      <w:r>
+        <w:rPr>
+          <w:rFonts w:ascii="Serif" w:hAnsi="Serif" w:cs="Arial"/>
+        </w:rPr>
+        <w:t>Aljohani</w:t>
+      </w:r>
+      <w:proofErr w:type="spellEnd"/>
+      <w:r>
+        <w:rPr>
+          <w:rFonts w:ascii="Serif" w:hAnsi="Serif" w:cs="Arial"/>
+        </w:rPr>
+        <w:t>, 2023)</w:t>
       </w:r>
     </w:p>
     <w:p>
@@ -2056,7 +2336,21 @@
         <w:rPr>
           <w:rFonts w:ascii="Serif" w:hAnsi="Serif" w:cs="Arial"/>
         </w:rPr>
-        <w:t xml:space="preserve">developed by Carlos and Suelen using the </w:t>
+        <w:t xml:space="preserve">developed by Carlos and </w:t>
+      </w:r>
+      <w:proofErr w:type="spellStart"/>
+      <w:r>
+        <w:rPr>
+          <w:rFonts w:ascii="Serif" w:hAnsi="Serif" w:cs="Arial"/>
+        </w:rPr>
+        <w:t>Suelen</w:t>
+      </w:r>
+      <w:proofErr w:type="spellEnd"/>
+      <w:r>
+        <w:rPr>
+          <w:rFonts w:ascii="Serif" w:hAnsi="Serif" w:cs="Arial"/>
+        </w:rPr>
+        <w:t xml:space="preserve"> using the </w:t>
       </w:r>
       <w:r>
         <w:rPr>
@@ -2356,7 +2650,21 @@
         <w:rPr>
           <w:rFonts w:ascii="Serif" w:hAnsi="Serif" w:cs="Arial"/>
         </w:rPr>
-        <w:t>(IBGE, 2023). Within this population, around 30 million people live in the Amazon region, including approximately 1.5 million Indigenous people. These communities depend on the Amazon forest for food, medicine, shelter, and traditional economic activities such as fishing and agriculture. Indigenous populations lived in the Amazon before the Portuguese arrived in Brazil, developing a strong cultural and environmental connection with the forest. Due to this historical relationship, Indigenous communities play a role in environmental preservation and protection. (Guitarrara, 2022)</w:t>
+        <w:t>(IBGE, 2023). Within this population, around 30 million people live in the Amazon region, including approximately 1.5 million Indigenous people. These communities depend on the Amazon forest for food, medicine, shelter, and traditional economic activities such as fishing and agriculture. Indigenous populations lived in the Amazon before the Portuguese arrived in Brazil, developing a strong cultural and environmental connection with the forest. Due to this historical relationship, Indigenous communities play a role in environmental preservation and protection. (</w:t>
+      </w:r>
+      <w:proofErr w:type="spellStart"/>
+      <w:r>
+        <w:rPr>
+          <w:rFonts w:ascii="Serif" w:hAnsi="Serif" w:cs="Arial"/>
+        </w:rPr>
+        <w:t>Guitarrara</w:t>
+      </w:r>
+      <w:proofErr w:type="spellEnd"/>
+      <w:r>
+        <w:rPr>
+          <w:rFonts w:ascii="Serif" w:hAnsi="Serif" w:cs="Arial"/>
+        </w:rPr>
+        <w:t>, 2022)</w:t>
       </w:r>
     </w:p>
     <w:p>
@@ -2416,7 +2724,21 @@
         <w:rPr>
           <w:rFonts w:ascii="Serif" w:hAnsi="Serif" w:cs="Arial"/>
         </w:rPr>
-        <w:t>Drones (UAVs) are used by agencies like IBAMA and ICMBio to capture high-resolution images, detect illegal deforestation, and monitor fires. Bioacoustics sensors and camera traps help track wildlife and identify illegal activities, while artificial intelligence (AI) analyses satellite and drone data for faster and more accurate detection of deforestation and environmental threats. (WWF Brasil, 2024).</w:t>
+        <w:t xml:space="preserve">Drones (UAVs) are used by agencies like IBAMA and ICMBio to capture high-resolution images, detect illegal deforestation, and monitor fires. Bioacoustics sensors and camera traps help track wildlife and identify illegal activities, while artificial intelligence (AI) analyses satellite and drone data for faster and more accurate detection of deforestation and environmental threats. (WWF </w:t>
+      </w:r>
+      <w:proofErr w:type="spellStart"/>
+      <w:r>
+        <w:rPr>
+          <w:rFonts w:ascii="Serif" w:hAnsi="Serif" w:cs="Arial"/>
+        </w:rPr>
+        <w:t>Brasil</w:t>
+      </w:r>
+      <w:proofErr w:type="spellEnd"/>
+      <w:r>
+        <w:rPr>
+          <w:rFonts w:ascii="Serif" w:hAnsi="Serif" w:cs="Arial"/>
+        </w:rPr>
+        <w:t>, 2024).</w:t>
       </w:r>
     </w:p>
     <w:p>
@@ -2430,7 +2752,49 @@
         <w:rPr>
           <w:rFonts w:ascii="Serif" w:hAnsi="Serif" w:cs="Arial"/>
         </w:rPr>
-        <w:t>Blockchain technology improves supply chain transparency. The startup Btracer developed the Hope Green NFT to track trees and restoration projects, providing secure, real-time records of carbon sequestration and forest conservation efforts. (Observatório Blockchain, 2025). Blockchain also supports compliance with the EU Deforestation Regulation (EUDR) by verifying product origins and ensuring deforestation-free sourcing through immutable records. (Astrakode, 2024)</w:t>
+        <w:t xml:space="preserve">Blockchain technology improves supply chain transparency. The startup </w:t>
+      </w:r>
+      <w:proofErr w:type="spellStart"/>
+      <w:r>
+        <w:rPr>
+          <w:rFonts w:ascii="Serif" w:hAnsi="Serif" w:cs="Arial"/>
+        </w:rPr>
+        <w:t>Btracer</w:t>
+      </w:r>
+      <w:proofErr w:type="spellEnd"/>
+      <w:r>
+        <w:rPr>
+          <w:rFonts w:ascii="Serif" w:hAnsi="Serif" w:cs="Arial"/>
+        </w:rPr>
+        <w:t xml:space="preserve"> developed the Hope Green NFT to track trees and restoration projects, providing secure, real-time records of carbon sequestration and forest conservation efforts. (</w:t>
+      </w:r>
+      <w:proofErr w:type="spellStart"/>
+      <w:r>
+        <w:rPr>
+          <w:rFonts w:ascii="Serif" w:hAnsi="Serif" w:cs="Arial"/>
+        </w:rPr>
+        <w:t>Observatório</w:t>
+      </w:r>
+      <w:proofErr w:type="spellEnd"/>
+      <w:r>
+        <w:rPr>
+          <w:rFonts w:ascii="Serif" w:hAnsi="Serif" w:cs="Arial"/>
+        </w:rPr>
+        <w:t xml:space="preserve"> Blockchain, 2025). Blockchain also supports compliance with the EU Deforestation Regulation (EUDR) by verifying product origins and ensuring deforestation-free sourcing through immutable records. (</w:t>
+      </w:r>
+      <w:proofErr w:type="spellStart"/>
+      <w:r>
+        <w:rPr>
+          <w:rFonts w:ascii="Serif" w:hAnsi="Serif" w:cs="Arial"/>
+        </w:rPr>
+        <w:t>Astrakode</w:t>
+      </w:r>
+      <w:proofErr w:type="spellEnd"/>
+      <w:r>
+        <w:rPr>
+          <w:rFonts w:ascii="Serif" w:hAnsi="Serif" w:cs="Arial"/>
+        </w:rPr>
+        <w:t>, 2024)</w:t>
       </w:r>
     </w:p>
     <w:p>
@@ -2582,7 +2946,21 @@
         <w:rPr>
           <w:rFonts w:ascii="Serif" w:hAnsi="Serif" w:cs="Arial"/>
         </w:rPr>
-        <w:t xml:space="preserve">The datasets used are accurate and up-to-date </w:t>
+        <w:t xml:space="preserve">The datasets used are accurate and </w:t>
+      </w:r>
+      <w:proofErr w:type="gramStart"/>
+      <w:r>
+        <w:rPr>
+          <w:rFonts w:ascii="Serif" w:hAnsi="Serif" w:cs="Arial"/>
+        </w:rPr>
+        <w:t>up-to-date</w:t>
+      </w:r>
+      <w:proofErr w:type="gramEnd"/>
+      <w:r>
+        <w:rPr>
+          <w:rFonts w:ascii="Serif" w:hAnsi="Serif" w:cs="Arial"/>
+        </w:rPr>
+        <w:t xml:space="preserve"> </w:t>
       </w:r>
     </w:p>
     <w:p>
@@ -2822,7 +3200,21 @@
         <w:rPr>
           <w:rFonts w:ascii="Serif" w:hAnsi="Serif" w:cs="Arial"/>
         </w:rPr>
-        <w:t>: To address integration challenges, data preprocessing and standardisation techniques will be applied to ensure consistency across datasets.</w:t>
+        <w:t xml:space="preserve">: To address integration challenges, data preprocessing and </w:t>
+      </w:r>
+      <w:proofErr w:type="spellStart"/>
+      <w:r>
+        <w:rPr>
+          <w:rFonts w:ascii="Serif" w:hAnsi="Serif" w:cs="Arial"/>
+        </w:rPr>
+        <w:t>standardisation</w:t>
+      </w:r>
+      <w:proofErr w:type="spellEnd"/>
+      <w:r>
+        <w:rPr>
+          <w:rFonts w:ascii="Serif" w:hAnsi="Serif" w:cs="Arial"/>
+        </w:rPr>
+        <w:t xml:space="preserve"> techniques will be applied to ensure consistency across datasets.</w:t>
       </w:r>
     </w:p>
     <w:p>
@@ -2902,7 +3294,35 @@
         <w:rPr>
           <w:rFonts w:ascii="Serif" w:hAnsi="Serif" w:cs="Arial"/>
         </w:rPr>
-        <w:t>: The model will be considered successful if it minimises prediction error (loss), generalises well to unseen data, and captures key relationships between variables, resulting in accurate and reliable predictions of CO₂ emissions.</w:t>
+        <w:t xml:space="preserve">: The model will be considered successful if it </w:t>
+      </w:r>
+      <w:proofErr w:type="spellStart"/>
+      <w:r>
+        <w:rPr>
+          <w:rFonts w:ascii="Serif" w:hAnsi="Serif" w:cs="Arial"/>
+        </w:rPr>
+        <w:t>minimises</w:t>
+      </w:r>
+      <w:proofErr w:type="spellEnd"/>
+      <w:r>
+        <w:rPr>
+          <w:rFonts w:ascii="Serif" w:hAnsi="Serif" w:cs="Arial"/>
+        </w:rPr>
+        <w:t xml:space="preserve"> prediction error (loss), </w:t>
+      </w:r>
+      <w:proofErr w:type="spellStart"/>
+      <w:r>
+        <w:rPr>
+          <w:rFonts w:ascii="Serif" w:hAnsi="Serif" w:cs="Arial"/>
+        </w:rPr>
+        <w:t>generalises</w:t>
+      </w:r>
+      <w:proofErr w:type="spellEnd"/>
+      <w:r>
+        <w:rPr>
+          <w:rFonts w:ascii="Serif" w:hAnsi="Serif" w:cs="Arial"/>
+        </w:rPr>
+        <w:t xml:space="preserve"> well to unseen data, and captures key relationships between variables, resulting in accurate and reliable predictions of CO₂ emissions.</w:t>
       </w:r>
     </w:p>
     <w:p>
@@ -2922,6 +3342,7 @@
         </w:rPr>
       </w:pPr>
       <w:bookmarkStart w:id="21" w:name="_Toc229512929"/>
+      <w:proofErr w:type="gramStart"/>
       <w:r>
         <w:rPr>
           <w:rFonts w:ascii="Serif" w:hAnsi="Serif" w:cs="Arial"/>
@@ -2930,6 +3351,7 @@
         </w:rPr>
         <w:t>2 .</w:t>
       </w:r>
+      <w:proofErr w:type="gramEnd"/>
       <w:r>
         <w:rPr>
           <w:rFonts w:ascii="Serif" w:hAnsi="Serif" w:cs="Arial"/>
@@ -2960,7 +3382,63 @@
         <w:rPr>
           <w:rFonts w:ascii="Serif" w:hAnsi="Serif" w:cs="Arial"/>
         </w:rPr>
-        <w:t>To develop the model, three datasets were initially collected to explore the relationship between deforestation and CO₂ emissions. The data was obtained from publicly available sources, including TerraBrasilis for deforestation monitoring (TerraBrasilis, n.d.), TRASE for livestock production (zu Ermgassen et al., 2023), and INPE for CO₂ emissions data (Crispim and Bezerra, 2019). An exploratory data analysis (EDA) was conducted on all datasets; however, integrating them was not suitable for the scope of this project.</w:t>
+        <w:t xml:space="preserve">To develop the model, three datasets were initially collected to explore the relationship between deforestation and CO₂ emissions. The data was obtained from publicly available sources, including </w:t>
+      </w:r>
+      <w:proofErr w:type="spellStart"/>
+      <w:r>
+        <w:rPr>
+          <w:rFonts w:ascii="Serif" w:hAnsi="Serif" w:cs="Arial"/>
+        </w:rPr>
+        <w:t>TerraBrasilis</w:t>
+      </w:r>
+      <w:proofErr w:type="spellEnd"/>
+      <w:r>
+        <w:rPr>
+          <w:rFonts w:ascii="Serif" w:hAnsi="Serif" w:cs="Arial"/>
+        </w:rPr>
+        <w:t xml:space="preserve"> for deforestation monitoring (</w:t>
+      </w:r>
+      <w:proofErr w:type="spellStart"/>
+      <w:r>
+        <w:rPr>
+          <w:rFonts w:ascii="Serif" w:hAnsi="Serif" w:cs="Arial"/>
+        </w:rPr>
+        <w:t>TerraBrasilis</w:t>
+      </w:r>
+      <w:proofErr w:type="spellEnd"/>
+      <w:r>
+        <w:rPr>
+          <w:rFonts w:ascii="Serif" w:hAnsi="Serif" w:cs="Arial"/>
+        </w:rPr>
+        <w:t>, n.d.), TRASE for livestock production (</w:t>
+      </w:r>
+      <w:proofErr w:type="spellStart"/>
+      <w:r>
+        <w:rPr>
+          <w:rFonts w:ascii="Serif" w:hAnsi="Serif" w:cs="Arial"/>
+        </w:rPr>
+        <w:t>zu</w:t>
+      </w:r>
+      <w:proofErr w:type="spellEnd"/>
+      <w:r>
+        <w:rPr>
+          <w:rFonts w:ascii="Serif" w:hAnsi="Serif" w:cs="Arial"/>
+        </w:rPr>
+        <w:t xml:space="preserve"> </w:t>
+      </w:r>
+      <w:proofErr w:type="spellStart"/>
+      <w:r>
+        <w:rPr>
+          <w:rFonts w:ascii="Serif" w:hAnsi="Serif" w:cs="Arial"/>
+        </w:rPr>
+        <w:t>Ermgassen</w:t>
+      </w:r>
+      <w:proofErr w:type="spellEnd"/>
+      <w:r>
+        <w:rPr>
+          <w:rFonts w:ascii="Serif" w:hAnsi="Serif" w:cs="Arial"/>
+        </w:rPr>
+        <w:t xml:space="preserve"> et al., 2023), and INPE for CO₂ emissions data (Crispim and Bezerra, 2019). An exploratory data analysis (EDA) was conducted on all datasets; however, integrating them was not suitable for the scope of this project.</w:t>
       </w:r>
     </w:p>
     <w:p>
@@ -2989,6 +3467,7 @@
         </w:rPr>
         <w:t xml:space="preserve"> production. While the deforestation and CO₂ datasets provide aggregate values from multiple sources, they do not isolate emissions or deforestation caused by cattle-related activities. Including these variables would introduce noise and reduce the relevance of the model. In contrast, the </w:t>
       </w:r>
+      <w:proofErr w:type="spellStart"/>
       <w:r>
         <w:rPr>
           <w:rFonts w:ascii="Serif" w:hAnsi="Serif" w:cs="Arial"/>
@@ -3013,6 +3492,7 @@
         </w:rPr>
         <w:t>mazon</w:t>
       </w:r>
+      <w:proofErr w:type="spellEnd"/>
       <w:r>
         <w:rPr>
           <w:rFonts w:ascii="Serif" w:hAnsi="Serif" w:cs="Arial"/>
@@ -3063,6 +3543,7 @@
         </w:rPr>
         <w:t xml:space="preserve">- The </w:t>
       </w:r>
+      <w:proofErr w:type="spellStart"/>
       <w:r>
         <w:rPr>
           <w:rFonts w:ascii="Serif" w:hAnsi="Serif"/>
@@ -3071,6 +3552,7 @@
         </w:rPr>
         <w:t>beef_amazon</w:t>
       </w:r>
+      <w:proofErr w:type="spellEnd"/>
       <w:r>
         <w:rPr>
           <w:rFonts w:ascii="Serif" w:hAnsi="Serif"/>
@@ -3248,14 +3730,27 @@
                             <w:r>
                               <w:t xml:space="preserve">Figure </w:t>
                             </w:r>
-                            <w:fldSimple w:instr=" SEQ Figure \* ARABIC ">
-                              <w:r>
-                                <w:rPr>
-                                  <w:noProof/>
-                                </w:rPr>
-                                <w:t>1</w:t>
-                              </w:r>
-                            </w:fldSimple>
+                            <w:r>
+                              <w:fldChar w:fldCharType="begin"/>
+                            </w:r>
+                            <w:r>
+                              <w:instrText xml:space="preserve"> SEQ Figure \* ARABIC </w:instrText>
+                            </w:r>
+                            <w:r>
+                              <w:fldChar w:fldCharType="separate"/>
+                            </w:r>
+                            <w:r>
+                              <w:rPr>
+                                <w:noProof/>
+                              </w:rPr>
+                              <w:t>1</w:t>
+                            </w:r>
+                            <w:r>
+                              <w:rPr>
+                                <w:noProof/>
+                              </w:rPr>
+                              <w:fldChar w:fldCharType="end"/>
+                            </w:r>
                             <w:r>
                               <w:t>-</w:t>
                             </w:r>
@@ -3301,14 +3796,27 @@
                       <w:r>
                         <w:t xml:space="preserve">Figure </w:t>
                       </w:r>
-                      <w:fldSimple w:instr=" SEQ Figure \* ARABIC ">
-                        <w:r>
-                          <w:rPr>
-                            <w:noProof/>
-                          </w:rPr>
-                          <w:t>1</w:t>
-                        </w:r>
-                      </w:fldSimple>
+                      <w:r>
+                        <w:fldChar w:fldCharType="begin"/>
+                      </w:r>
+                      <w:r>
+                        <w:instrText xml:space="preserve"> SEQ Figure \* ARABIC </w:instrText>
+                      </w:r>
+                      <w:r>
+                        <w:fldChar w:fldCharType="separate"/>
+                      </w:r>
+                      <w:r>
+                        <w:rPr>
+                          <w:noProof/>
+                        </w:rPr>
+                        <w:t>1</w:t>
+                      </w:r>
+                      <w:r>
+                        <w:rPr>
+                          <w:noProof/>
+                        </w:rPr>
+                        <w:fldChar w:fldCharType="end"/>
+                      </w:r>
                       <w:r>
                         <w:t>-</w:t>
                       </w:r>
@@ -3376,14 +3884,25 @@
         </w:rPr>
         <w:t xml:space="preserve">The number of records in the </w:t>
       </w:r>
+      <w:proofErr w:type="spellStart"/>
       <w:r>
         <w:rPr>
           <w:rFonts w:ascii="Serif" w:hAnsi="Serif"/>
           <w:i/>
           <w:iCs/>
         </w:rPr>
-        <w:t>beef_amazon</w:t>
-      </w:r>
+        <w:t>beef_</w:t>
+      </w:r>
+      <w:proofErr w:type="gramStart"/>
+      <w:r>
+        <w:rPr>
+          <w:rFonts w:ascii="Serif" w:hAnsi="Serif"/>
+          <w:i/>
+          <w:iCs/>
+        </w:rPr>
+        <w:t>amazon</w:t>
+      </w:r>
+      <w:proofErr w:type="spellEnd"/>
       <w:r>
         <w:rPr>
           <w:rFonts w:ascii="Serif" w:hAnsi="Serif"/>
@@ -3400,7 +3919,14 @@
         <w:rPr>
           <w:rFonts w:ascii="Serif" w:hAnsi="Serif"/>
         </w:rPr>
-        <w:t>dataset is 839,727 rows and 26 columns.</w:t>
+        <w:t>dataset</w:t>
+      </w:r>
+      <w:proofErr w:type="gramEnd"/>
+      <w:r>
+        <w:rPr>
+          <w:rFonts w:ascii="Serif" w:hAnsi="Serif"/>
+        </w:rPr>
+        <w:t xml:space="preserve"> is 839,727 rows and 26 columns.</w:t>
       </w:r>
     </w:p>
     <w:p>
@@ -3548,14 +4074,27 @@
                             <w:r>
                               <w:t xml:space="preserve">Figure </w:t>
                             </w:r>
-                            <w:fldSimple w:instr=" SEQ Figure \* ARABIC ">
-                              <w:r>
-                                <w:rPr>
-                                  <w:noProof/>
-                                </w:rPr>
-                                <w:t>2</w:t>
-                              </w:r>
-                            </w:fldSimple>
+                            <w:r>
+                              <w:fldChar w:fldCharType="begin"/>
+                            </w:r>
+                            <w:r>
+                              <w:instrText xml:space="preserve"> SEQ Figure \* ARABIC </w:instrText>
+                            </w:r>
+                            <w:r>
+                              <w:fldChar w:fldCharType="separate"/>
+                            </w:r>
+                            <w:r>
+                              <w:rPr>
+                                <w:noProof/>
+                              </w:rPr>
+                              <w:t>2</w:t>
+                            </w:r>
+                            <w:r>
+                              <w:rPr>
+                                <w:noProof/>
+                              </w:rPr>
+                              <w:fldChar w:fldCharType="end"/>
+                            </w:r>
                             <w:r>
                               <w:t>-</w:t>
                             </w:r>
@@ -3598,14 +4137,27 @@
                       <w:r>
                         <w:t xml:space="preserve">Figure </w:t>
                       </w:r>
-                      <w:fldSimple w:instr=" SEQ Figure \* ARABIC ">
-                        <w:r>
-                          <w:rPr>
-                            <w:noProof/>
-                          </w:rPr>
-                          <w:t>2</w:t>
-                        </w:r>
-                      </w:fldSimple>
+                      <w:r>
+                        <w:fldChar w:fldCharType="begin"/>
+                      </w:r>
+                      <w:r>
+                        <w:instrText xml:space="preserve"> SEQ Figure \* ARABIC </w:instrText>
+                      </w:r>
+                      <w:r>
+                        <w:fldChar w:fldCharType="separate"/>
+                      </w:r>
+                      <w:r>
+                        <w:rPr>
+                          <w:noProof/>
+                        </w:rPr>
+                        <w:t>2</w:t>
+                      </w:r>
+                      <w:r>
+                        <w:rPr>
+                          <w:noProof/>
+                        </w:rPr>
+                        <w:fldChar w:fldCharType="end"/>
+                      </w:r>
                       <w:r>
                         <w:t>-</w:t>
                       </w:r>
@@ -3699,14 +4251,27 @@
                             <w:r>
                               <w:t xml:space="preserve">Figure </w:t>
                             </w:r>
-                            <w:fldSimple w:instr=" SEQ Figure \* ARABIC ">
-                              <w:r>
-                                <w:rPr>
-                                  <w:noProof/>
-                                </w:rPr>
-                                <w:t>3</w:t>
-                              </w:r>
-                            </w:fldSimple>
+                            <w:r>
+                              <w:fldChar w:fldCharType="begin"/>
+                            </w:r>
+                            <w:r>
+                              <w:instrText xml:space="preserve"> SEQ Figure \* ARABIC </w:instrText>
+                            </w:r>
+                            <w:r>
+                              <w:fldChar w:fldCharType="separate"/>
+                            </w:r>
+                            <w:r>
+                              <w:rPr>
+                                <w:noProof/>
+                              </w:rPr>
+                              <w:t>3</w:t>
+                            </w:r>
+                            <w:r>
+                              <w:rPr>
+                                <w:noProof/>
+                              </w:rPr>
+                              <w:fldChar w:fldCharType="end"/>
+                            </w:r>
                             <w:r>
                               <w:t>-</w:t>
                             </w:r>
@@ -3747,14 +4312,27 @@
                       <w:r>
                         <w:t xml:space="preserve">Figure </w:t>
                       </w:r>
-                      <w:fldSimple w:instr=" SEQ Figure \* ARABIC ">
-                        <w:r>
-                          <w:rPr>
-                            <w:noProof/>
-                          </w:rPr>
-                          <w:t>3</w:t>
-                        </w:r>
-                      </w:fldSimple>
+                      <w:r>
+                        <w:fldChar w:fldCharType="begin"/>
+                      </w:r>
+                      <w:r>
+                        <w:instrText xml:space="preserve"> SEQ Figure \* ARABIC </w:instrText>
+                      </w:r>
+                      <w:r>
+                        <w:fldChar w:fldCharType="separate"/>
+                      </w:r>
+                      <w:r>
+                        <w:rPr>
+                          <w:noProof/>
+                        </w:rPr>
+                        <w:t>3</w:t>
+                      </w:r>
+                      <w:r>
+                        <w:rPr>
+                          <w:noProof/>
+                        </w:rPr>
+                        <w:fldChar w:fldCharType="end"/>
+                      </w:r>
                       <w:r>
                         <w:t>-</w:t>
                       </w:r>
@@ -3846,6 +4424,7 @@
         </w:rPr>
         <w:t xml:space="preserve">The </w:t>
       </w:r>
+      <w:proofErr w:type="spellStart"/>
       <w:r>
         <w:rPr>
           <w:rFonts w:ascii="Serif" w:hAnsi="Serif"/>
@@ -3854,6 +4433,7 @@
         </w:rPr>
         <w:t>beef_amazon</w:t>
       </w:r>
+      <w:proofErr w:type="spellEnd"/>
       <w:r>
         <w:rPr>
           <w:rFonts w:ascii="Serif" w:hAnsi="Serif"/>
@@ -3910,13 +4490,23 @@
         </w:rPr>
         <w:t xml:space="preserve">Other surface features of the </w:t>
       </w:r>
+      <w:proofErr w:type="spellStart"/>
       <w:r>
         <w:rPr>
           <w:rFonts w:ascii="Serif" w:hAnsi="Serif"/>
           <w:i/>
           <w:iCs/>
         </w:rPr>
-        <w:t xml:space="preserve">beef_amazon </w:t>
+        <w:t>beef_amazon</w:t>
+      </w:r>
+      <w:proofErr w:type="spellEnd"/>
+      <w:r>
+        <w:rPr>
+          <w:rFonts w:ascii="Serif" w:hAnsi="Serif"/>
+          <w:i/>
+          <w:iCs/>
+        </w:rPr>
+        <w:t xml:space="preserve"> </w:t>
       </w:r>
       <w:r>
         <w:rPr>
@@ -4024,19 +4614,40 @@
                             <w:r>
                               <w:t xml:space="preserve">Figure </w:t>
                             </w:r>
-                            <w:fldSimple w:instr=" SEQ Figure \* ARABIC ">
-                              <w:r>
-                                <w:rPr>
-                                  <w:noProof/>
-                                </w:rPr>
-                                <w:t>4</w:t>
-                              </w:r>
-                            </w:fldSimple>
+                            <w:r>
+                              <w:fldChar w:fldCharType="begin"/>
+                            </w:r>
+                            <w:r>
+                              <w:instrText xml:space="preserve"> SEQ Figure \* ARABIC </w:instrText>
+                            </w:r>
+                            <w:r>
+                              <w:fldChar w:fldCharType="separate"/>
+                            </w:r>
+                            <w:r>
+                              <w:rPr>
+                                <w:noProof/>
+                              </w:rPr>
+                              <w:t>4</w:t>
+                            </w:r>
+                            <w:r>
+                              <w:rPr>
+                                <w:noProof/>
+                              </w:rPr>
+                              <w:fldChar w:fldCharType="end"/>
+                            </w:r>
                             <w:r>
                               <w:t>-</w:t>
                             </w:r>
                             <w:r>
-                              <w:t>Histograms showing the distribution of numerical variables in the beef_amazon dataset.</w:t>
+                              <w:t xml:space="preserve">Histograms showing the distribution of numerical variables in the </w:t>
+                            </w:r>
+                            <w:proofErr w:type="spellStart"/>
+                            <w:r>
+                              <w:t>beef_amazon</w:t>
+                            </w:r>
+                            <w:proofErr w:type="spellEnd"/>
+                            <w:r>
+                              <w:t xml:space="preserve"> dataset.</w:t>
                             </w:r>
                             <w:bookmarkEnd w:id="32"/>
                           </w:p>
@@ -4071,19 +4682,40 @@
                       <w:r>
                         <w:t xml:space="preserve">Figure </w:t>
                       </w:r>
-                      <w:fldSimple w:instr=" SEQ Figure \* ARABIC ">
-                        <w:r>
-                          <w:rPr>
-                            <w:noProof/>
-                          </w:rPr>
-                          <w:t>4</w:t>
-                        </w:r>
-                      </w:fldSimple>
+                      <w:r>
+                        <w:fldChar w:fldCharType="begin"/>
+                      </w:r>
+                      <w:r>
+                        <w:instrText xml:space="preserve"> SEQ Figure \* ARABIC </w:instrText>
+                      </w:r>
+                      <w:r>
+                        <w:fldChar w:fldCharType="separate"/>
+                      </w:r>
+                      <w:r>
+                        <w:rPr>
+                          <w:noProof/>
+                        </w:rPr>
+                        <w:t>4</w:t>
+                      </w:r>
+                      <w:r>
+                        <w:rPr>
+                          <w:noProof/>
+                        </w:rPr>
+                        <w:fldChar w:fldCharType="end"/>
+                      </w:r>
                       <w:r>
                         <w:t>-</w:t>
                       </w:r>
                       <w:r>
-                        <w:t>Histograms showing the distribution of numerical variables in the beef_amazon dataset.</w:t>
+                        <w:t xml:space="preserve">Histograms showing the distribution of numerical variables in the </w:t>
+                      </w:r>
+                      <w:proofErr w:type="spellStart"/>
+                      <w:r>
+                        <w:t>beef_amazon</w:t>
+                      </w:r>
+                      <w:proofErr w:type="spellEnd"/>
+                      <w:r>
+                        <w:t xml:space="preserve"> dataset.</w:t>
                       </w:r>
                       <w:bookmarkEnd w:id="33"/>
                     </w:p>
@@ -4190,7 +4822,21 @@
         <w:rPr>
           <w:rFonts w:ascii="Serif" w:hAnsi="Serif"/>
         </w:rPr>
-        <w:t xml:space="preserve">Histograms were used to examine the distribution of numerical variables in the beef_amazon dataset. Most variables, including CO₂ emissions, cattle deforestation, land use, and FOB values, exhibit strong right-skewness, with most observations concentrated at lower values and a long tail extending toward higher values. </w:t>
+        <w:t xml:space="preserve">Histograms were used to examine the distribution of numerical variables in the </w:t>
+      </w:r>
+      <w:proofErr w:type="spellStart"/>
+      <w:r>
+        <w:rPr>
+          <w:rFonts w:ascii="Serif" w:hAnsi="Serif"/>
+        </w:rPr>
+        <w:t>beef_amazon</w:t>
+      </w:r>
+      <w:proofErr w:type="spellEnd"/>
+      <w:r>
+        <w:rPr>
+          <w:rFonts w:ascii="Serif" w:hAnsi="Serif"/>
+        </w:rPr>
+        <w:t xml:space="preserve"> dataset. Most variables, including CO₂ emissions, cattle deforestation, land use, and FOB values, exhibit strong right-skewness, with most observations concentrated at lower values and a long tail extending toward higher values. </w:t>
       </w:r>
       <w:r>
         <w:rPr>
@@ -4216,7 +4862,49 @@
         <w:rPr>
           <w:rFonts w:ascii="Serif" w:hAnsi="Serif"/>
         </w:rPr>
-        <w:t>The year variable shows a more distributed pattern across different years, while volume contains most observations between 0.5 and 1. In contrast, variables such as cattle_deforestation, co2 gross, co2 net, land_use, and fob are highly right-skewed, with most values concentrated near zero and a smaller number of higher values. Overall, these patterns indicate significant skewness within the dataset, which should be considered during preprocessing and modelling.</w:t>
+        <w:t xml:space="preserve">The year variable shows a more distributed pattern across different years, while volume contains most observations between 0.5 and 1. In contrast, variables such as </w:t>
+      </w:r>
+      <w:proofErr w:type="spellStart"/>
+      <w:r>
+        <w:rPr>
+          <w:rFonts w:ascii="Serif" w:hAnsi="Serif"/>
+        </w:rPr>
+        <w:t>cattle_deforestation</w:t>
+      </w:r>
+      <w:proofErr w:type="spellEnd"/>
+      <w:r>
+        <w:rPr>
+          <w:rFonts w:ascii="Serif" w:hAnsi="Serif"/>
+        </w:rPr>
+        <w:t xml:space="preserve">, co2 gross, co2 net, </w:t>
+      </w:r>
+      <w:proofErr w:type="spellStart"/>
+      <w:r>
+        <w:rPr>
+          <w:rFonts w:ascii="Serif" w:hAnsi="Serif"/>
+        </w:rPr>
+        <w:t>land_use</w:t>
+      </w:r>
+      <w:proofErr w:type="spellEnd"/>
+      <w:r>
+        <w:rPr>
+          <w:rFonts w:ascii="Serif" w:hAnsi="Serif"/>
+        </w:rPr>
+        <w:t xml:space="preserve">, and fob are highly </w:t>
+      </w:r>
+      <w:proofErr w:type="gramStart"/>
+      <w:r>
+        <w:rPr>
+          <w:rFonts w:ascii="Serif" w:hAnsi="Serif"/>
+        </w:rPr>
+        <w:t>right-skewed</w:t>
+      </w:r>
+      <w:proofErr w:type="gramEnd"/>
+      <w:r>
+        <w:rPr>
+          <w:rFonts w:ascii="Serif" w:hAnsi="Serif"/>
+        </w:rPr>
+        <w:t>, with most values concentrated near zero and a smaller number of higher values. Overall, these patterns indicate significant skewness within the dataset, which should be considered during preprocessing and modelling.</w:t>
       </w:r>
     </w:p>
     <w:p>
@@ -4274,8 +4962,23 @@
         <w:rPr>
           <w:rFonts w:ascii="Serif" w:hAnsi="Serif"/>
         </w:rPr>
-        <w:t xml:space="preserve">Boxplots were used to analyse the spread of numeric variables in the </w:t>
-      </w:r>
+        <w:t xml:space="preserve">Boxplots were used to </w:t>
+      </w:r>
+      <w:proofErr w:type="spellStart"/>
+      <w:r>
+        <w:rPr>
+          <w:rFonts w:ascii="Serif" w:hAnsi="Serif"/>
+        </w:rPr>
+        <w:t>analyse</w:t>
+      </w:r>
+      <w:proofErr w:type="spellEnd"/>
+      <w:r>
+        <w:rPr>
+          <w:rFonts w:ascii="Serif" w:hAnsi="Serif"/>
+        </w:rPr>
+        <w:t xml:space="preserve"> the spread of numeric variables in the </w:t>
+      </w:r>
+      <w:proofErr w:type="spellStart"/>
       <w:r>
         <w:rPr>
           <w:rFonts w:ascii="Serif" w:hAnsi="Serif"/>
@@ -4284,6 +4987,7 @@
         </w:rPr>
         <w:t>beef_amazon</w:t>
       </w:r>
+      <w:proofErr w:type="spellEnd"/>
       <w:r>
         <w:rPr>
           <w:rFonts w:ascii="Serif" w:hAnsi="Serif"/>
@@ -4363,14 +5067,27 @@
                             <w:r>
                               <w:t xml:space="preserve">Figure </w:t>
                             </w:r>
-                            <w:fldSimple w:instr=" SEQ Figure \* ARABIC ">
-                              <w:r>
-                                <w:rPr>
-                                  <w:noProof/>
-                                </w:rPr>
-                                <w:t>5</w:t>
-                              </w:r>
-                            </w:fldSimple>
+                            <w:r>
+                              <w:fldChar w:fldCharType="begin"/>
+                            </w:r>
+                            <w:r>
+                              <w:instrText xml:space="preserve"> SEQ Figure \* ARABIC </w:instrText>
+                            </w:r>
+                            <w:r>
+                              <w:fldChar w:fldCharType="separate"/>
+                            </w:r>
+                            <w:r>
+                              <w:rPr>
+                                <w:noProof/>
+                              </w:rPr>
+                              <w:t>5</w:t>
+                            </w:r>
+                            <w:r>
+                              <w:rPr>
+                                <w:noProof/>
+                              </w:rPr>
+                              <w:fldChar w:fldCharType="end"/>
+                            </w:r>
                             <w:r>
                               <w:t>-</w:t>
                             </w:r>
@@ -4410,14 +5127,27 @@
                       <w:r>
                         <w:t xml:space="preserve">Figure </w:t>
                       </w:r>
-                      <w:fldSimple w:instr=" SEQ Figure \* ARABIC ">
-                        <w:r>
-                          <w:rPr>
-                            <w:noProof/>
-                          </w:rPr>
-                          <w:t>5</w:t>
-                        </w:r>
-                      </w:fldSimple>
+                      <w:r>
+                        <w:fldChar w:fldCharType="begin"/>
+                      </w:r>
+                      <w:r>
+                        <w:instrText xml:space="preserve"> SEQ Figure \* ARABIC </w:instrText>
+                      </w:r>
+                      <w:r>
+                        <w:fldChar w:fldCharType="separate"/>
+                      </w:r>
+                      <w:r>
+                        <w:rPr>
+                          <w:noProof/>
+                        </w:rPr>
+                        <w:t>5</w:t>
+                      </w:r>
+                      <w:r>
+                        <w:rPr>
+                          <w:noProof/>
+                        </w:rPr>
+                        <w:fldChar w:fldCharType="end"/>
+                      </w:r>
                       <w:r>
                         <w:t>-</w:t>
                       </w:r>
@@ -4666,14 +5396,27 @@
                             <w:r>
                               <w:t xml:space="preserve">Figure </w:t>
                             </w:r>
-                            <w:fldSimple w:instr=" SEQ Figure \* ARABIC ">
-                              <w:r>
-                                <w:rPr>
-                                  <w:noProof/>
-                                </w:rPr>
-                                <w:t>6</w:t>
-                              </w:r>
-                            </w:fldSimple>
+                            <w:r>
+                              <w:fldChar w:fldCharType="begin"/>
+                            </w:r>
+                            <w:r>
+                              <w:instrText xml:space="preserve"> SEQ Figure \* ARABIC </w:instrText>
+                            </w:r>
+                            <w:r>
+                              <w:fldChar w:fldCharType="separate"/>
+                            </w:r>
+                            <w:r>
+                              <w:rPr>
+                                <w:noProof/>
+                              </w:rPr>
+                              <w:t>6</w:t>
+                            </w:r>
+                            <w:r>
+                              <w:rPr>
+                                <w:noProof/>
+                              </w:rPr>
+                              <w:fldChar w:fldCharType="end"/>
+                            </w:r>
                             <w:r>
                               <w:t>-</w:t>
                             </w:r>
@@ -4714,14 +5457,27 @@
                       <w:r>
                         <w:t xml:space="preserve">Figure </w:t>
                       </w:r>
-                      <w:fldSimple w:instr=" SEQ Figure \* ARABIC ">
-                        <w:r>
-                          <w:rPr>
-                            <w:noProof/>
-                          </w:rPr>
-                          <w:t>6</w:t>
-                        </w:r>
-                      </w:fldSimple>
+                      <w:r>
+                        <w:fldChar w:fldCharType="begin"/>
+                      </w:r>
+                      <w:r>
+                        <w:instrText xml:space="preserve"> SEQ Figure \* ARABIC </w:instrText>
+                      </w:r>
+                      <w:r>
+                        <w:fldChar w:fldCharType="separate"/>
+                      </w:r>
+                      <w:r>
+                        <w:rPr>
+                          <w:noProof/>
+                        </w:rPr>
+                        <w:t>6</w:t>
+                      </w:r>
+                      <w:r>
+                        <w:rPr>
+                          <w:noProof/>
+                        </w:rPr>
+                        <w:fldChar w:fldCharType="end"/>
+                      </w:r>
                       <w:r>
                         <w:t>-</w:t>
                       </w:r>
@@ -4976,8 +5732,23 @@
         <w:rPr>
           <w:rFonts w:ascii="Serif" w:hAnsi="Serif"/>
         </w:rPr>
-        <w:t xml:space="preserve">Simple aggregations were used to analyse trends over time in the </w:t>
-      </w:r>
+        <w:t xml:space="preserve">Simple aggregations were used to </w:t>
+      </w:r>
+      <w:proofErr w:type="spellStart"/>
+      <w:r>
+        <w:rPr>
+          <w:rFonts w:ascii="Serif" w:hAnsi="Serif"/>
+        </w:rPr>
+        <w:t>analyse</w:t>
+      </w:r>
+      <w:proofErr w:type="spellEnd"/>
+      <w:r>
+        <w:rPr>
+          <w:rFonts w:ascii="Serif" w:hAnsi="Serif"/>
+        </w:rPr>
+        <w:t xml:space="preserve"> trends over time in the </w:t>
+      </w:r>
+      <w:proofErr w:type="spellStart"/>
       <w:r>
         <w:rPr>
           <w:rFonts w:ascii="Serif" w:hAnsi="Serif"/>
@@ -5002,6 +5773,7 @@
         </w:rPr>
         <w:t>mazon</w:t>
       </w:r>
+      <w:proofErr w:type="spellEnd"/>
       <w:r>
         <w:rPr>
           <w:rFonts w:ascii="Serif" w:hAnsi="Serif"/>
@@ -5076,14 +5848,27 @@
                             <w:r>
                               <w:t xml:space="preserve">Figure </w:t>
                             </w:r>
-                            <w:fldSimple w:instr=" SEQ Figure \* ARABIC ">
-                              <w:r>
-                                <w:rPr>
-                                  <w:noProof/>
-                                </w:rPr>
-                                <w:t>7</w:t>
-                              </w:r>
-                            </w:fldSimple>
+                            <w:r>
+                              <w:fldChar w:fldCharType="begin"/>
+                            </w:r>
+                            <w:r>
+                              <w:instrText xml:space="preserve"> SEQ Figure \* ARABIC </w:instrText>
+                            </w:r>
+                            <w:r>
+                              <w:fldChar w:fldCharType="separate"/>
+                            </w:r>
+                            <w:r>
+                              <w:rPr>
+                                <w:noProof/>
+                              </w:rPr>
+                              <w:t>7</w:t>
+                            </w:r>
+                            <w:r>
+                              <w:rPr>
+                                <w:noProof/>
+                              </w:rPr>
+                              <w:fldChar w:fldCharType="end"/>
+                            </w:r>
                             <w:r>
                               <w:t>-</w:t>
                             </w:r>
@@ -5124,14 +5909,27 @@
                       <w:r>
                         <w:t xml:space="preserve">Figure </w:t>
                       </w:r>
-                      <w:fldSimple w:instr=" SEQ Figure \* ARABIC ">
-                        <w:r>
-                          <w:rPr>
-                            <w:noProof/>
-                          </w:rPr>
-                          <w:t>7</w:t>
-                        </w:r>
-                      </w:fldSimple>
+                      <w:r>
+                        <w:fldChar w:fldCharType="begin"/>
+                      </w:r>
+                      <w:r>
+                        <w:instrText xml:space="preserve"> SEQ Figure \* ARABIC </w:instrText>
+                      </w:r>
+                      <w:r>
+                        <w:fldChar w:fldCharType="separate"/>
+                      </w:r>
+                      <w:r>
+                        <w:rPr>
+                          <w:noProof/>
+                        </w:rPr>
+                        <w:t>7</w:t>
+                      </w:r>
+                      <w:r>
+                        <w:rPr>
+                          <w:noProof/>
+                        </w:rPr>
+                        <w:fldChar w:fldCharType="end"/>
+                      </w:r>
                       <w:r>
                         <w:t>-</w:t>
                       </w:r>
@@ -5705,7 +6503,21 @@
         <w:rPr>
           <w:rFonts w:ascii="Serif" w:hAnsi="Serif"/>
         </w:rPr>
-        <w:t>For the data cleaning phase, three different techniques were applied to handle missing values in order to evaluate which approach would be most suitable for the model. In addition, invalid entries were identified and corrected, unnecessary columns were removed, and label encoding was implemented. The following approaches were considered:</w:t>
+        <w:t xml:space="preserve">For the data cleaning phase, three different techniques were applied to handle missing values </w:t>
+      </w:r>
+      <w:proofErr w:type="gramStart"/>
+      <w:r>
+        <w:rPr>
+          <w:rFonts w:ascii="Serif" w:hAnsi="Serif"/>
+        </w:rPr>
+        <w:t>in order to</w:t>
+      </w:r>
+      <w:proofErr w:type="gramEnd"/>
+      <w:r>
+        <w:rPr>
+          <w:rFonts w:ascii="Serif" w:hAnsi="Serif"/>
+        </w:rPr>
+        <w:t xml:space="preserve"> evaluate which approach would be most suitable for the model. In addition, invalid entries were identified and corrected, unnecessary columns were removed, and label encoding was implemented. The following approaches were considered:</w:t>
       </w:r>
     </w:p>
     <w:p>
@@ -5807,14 +6619,27 @@
                             <w:r>
                               <w:t xml:space="preserve">Figure </w:t>
                             </w:r>
-                            <w:fldSimple w:instr=" SEQ Figure \* ARABIC ">
-                              <w:r>
-                                <w:rPr>
-                                  <w:noProof/>
-                                </w:rPr>
-                                <w:t>8</w:t>
-                              </w:r>
-                            </w:fldSimple>
+                            <w:r>
+                              <w:fldChar w:fldCharType="begin"/>
+                            </w:r>
+                            <w:r>
+                              <w:instrText xml:space="preserve"> SEQ Figure \* ARABIC </w:instrText>
+                            </w:r>
+                            <w:r>
+                              <w:fldChar w:fldCharType="separate"/>
+                            </w:r>
+                            <w:r>
+                              <w:rPr>
+                                <w:noProof/>
+                              </w:rPr>
+                              <w:t>8</w:t>
+                            </w:r>
+                            <w:r>
+                              <w:rPr>
+                                <w:noProof/>
+                              </w:rPr>
+                              <w:fldChar w:fldCharType="end"/>
+                            </w:r>
                             <w:r>
                               <w:t>-</w:t>
                             </w:r>
@@ -5854,14 +6679,27 @@
                       <w:r>
                         <w:t xml:space="preserve">Figure </w:t>
                       </w:r>
-                      <w:fldSimple w:instr=" SEQ Figure \* ARABIC ">
-                        <w:r>
-                          <w:rPr>
-                            <w:noProof/>
-                          </w:rPr>
-                          <w:t>8</w:t>
-                        </w:r>
-                      </w:fldSimple>
+                      <w:r>
+                        <w:fldChar w:fldCharType="begin"/>
+                      </w:r>
+                      <w:r>
+                        <w:instrText xml:space="preserve"> SEQ Figure \* ARABIC </w:instrText>
+                      </w:r>
+                      <w:r>
+                        <w:fldChar w:fldCharType="separate"/>
+                      </w:r>
+                      <w:r>
+                        <w:rPr>
+                          <w:noProof/>
+                        </w:rPr>
+                        <w:t>8</w:t>
+                      </w:r>
+                      <w:r>
+                        <w:rPr>
+                          <w:noProof/>
+                        </w:rPr>
+                        <w:fldChar w:fldCharType="end"/>
+                      </w:r>
                       <w:r>
                         <w:t>-</w:t>
                       </w:r>
@@ -5975,19 +6813,53 @@
         </w:rPr>
         <w:t xml:space="preserve">The first approach involved removing all missing values from the dataset using the </w:t>
       </w:r>
+      <w:proofErr w:type="spellStart"/>
+      <w:proofErr w:type="gramStart"/>
       <w:r>
         <w:rPr>
           <w:rFonts w:ascii="Serif" w:hAnsi="Serif"/>
           <w:i/>
           <w:iCs/>
         </w:rPr>
-        <w:t>dropna()</w:t>
-      </w:r>
-      <w:r>
-        <w:rPr>
-          <w:rFonts w:ascii="Serif" w:hAnsi="Serif"/>
-        </w:rPr>
-        <w:t xml:space="preserve"> function.(pandas.pydata.org, n.d.)</w:t>
+        <w:t>dropna</w:t>
+      </w:r>
+      <w:proofErr w:type="spellEnd"/>
+      <w:r>
+        <w:rPr>
+          <w:rFonts w:ascii="Serif" w:hAnsi="Serif"/>
+          <w:i/>
+          <w:iCs/>
+        </w:rPr>
+        <w:t>(</w:t>
+      </w:r>
+      <w:proofErr w:type="gramEnd"/>
+      <w:r>
+        <w:rPr>
+          <w:rFonts w:ascii="Serif" w:hAnsi="Serif"/>
+          <w:i/>
+          <w:iCs/>
+        </w:rPr>
+        <w:t>)</w:t>
+      </w:r>
+      <w:r>
+        <w:rPr>
+          <w:rFonts w:ascii="Serif" w:hAnsi="Serif"/>
+        </w:rPr>
+        <w:t xml:space="preserve"> </w:t>
+      </w:r>
+      <w:proofErr w:type="gramStart"/>
+      <w:r>
+        <w:rPr>
+          <w:rFonts w:ascii="Serif" w:hAnsi="Serif"/>
+        </w:rPr>
+        <w:t>function.(</w:t>
+      </w:r>
+      <w:proofErr w:type="gramEnd"/>
+      <w:r>
+        <w:rPr>
+          <w:rFonts w:ascii="Serif" w:hAnsi="Serif"/>
+        </w:rPr>
+        <w:t>pandas.pydata.org, n.d.)</w:t>
       </w:r>
     </w:p>
     <w:p>
@@ -6024,14 +6896,26 @@
         </w:rPr>
         <w:t xml:space="preserve"> with </w:t>
       </w:r>
+      <w:proofErr w:type="spellStart"/>
+      <w:proofErr w:type="gramStart"/>
       <w:r>
         <w:rPr>
           <w:rFonts w:ascii="Serif" w:hAnsi="Serif"/>
           <w:i/>
           <w:iCs/>
         </w:rPr>
-        <w:t>fillna().median</w:t>
-      </w:r>
+        <w:t>fillna</w:t>
+      </w:r>
+      <w:proofErr w:type="spellEnd"/>
+      <w:r>
+        <w:rPr>
+          <w:rFonts w:ascii="Serif" w:hAnsi="Serif"/>
+          <w:i/>
+          <w:iCs/>
+        </w:rPr>
+        <w:t>().median</w:t>
+      </w:r>
+      <w:proofErr w:type="gramEnd"/>
       <w:r>
         <w:rPr>
           <w:rFonts w:ascii="Serif" w:hAnsi="Serif"/>
@@ -6042,7 +6926,21 @@
         <w:rPr>
           <w:rFonts w:ascii="Serif" w:hAnsi="Serif"/>
         </w:rPr>
-        <w:t xml:space="preserve"> (GeeksforGeeks, 2025)</w:t>
+        <w:t xml:space="preserve"> (</w:t>
+      </w:r>
+      <w:proofErr w:type="spellStart"/>
+      <w:r>
+        <w:rPr>
+          <w:rFonts w:ascii="Serif" w:hAnsi="Serif"/>
+        </w:rPr>
+        <w:t>GeeksforGeeks</w:t>
+      </w:r>
+      <w:proofErr w:type="spellEnd"/>
+      <w:r>
+        <w:rPr>
+          <w:rFonts w:ascii="Serif" w:hAnsi="Serif"/>
+        </w:rPr>
+        <w:t>, 2025)</w:t>
       </w:r>
     </w:p>
     <w:p>
@@ -6071,8 +6969,23 @@
         <w:rPr>
           <w:rFonts w:ascii="Serif" w:hAnsi="Serif"/>
         </w:rPr>
-        <w:t xml:space="preserve">  The third approach involved model-based imputation, which uses machine learning techniques to predict missing values (GeeksforGeeks, 2025). In this study, Linear Regression was first applied to estimate missing values in the </w:t>
-      </w:r>
+        <w:t xml:space="preserve">  The third approach involved model-based imputation, which uses machine learning techniques to predict missing values (</w:t>
+      </w:r>
+      <w:proofErr w:type="spellStart"/>
+      <w:r>
+        <w:rPr>
+          <w:rFonts w:ascii="Serif" w:hAnsi="Serif"/>
+        </w:rPr>
+        <w:t>GeeksforGeeks</w:t>
+      </w:r>
+      <w:proofErr w:type="spellEnd"/>
+      <w:r>
+        <w:rPr>
+          <w:rFonts w:ascii="Serif" w:hAnsi="Serif"/>
+        </w:rPr>
+        <w:t xml:space="preserve">, 2025). In this study, Linear Regression was first applied to estimate missing values in the </w:t>
+      </w:r>
+      <w:proofErr w:type="spellStart"/>
       <w:r>
         <w:rPr>
           <w:rFonts w:ascii="Serif" w:hAnsi="Serif"/>
@@ -6081,6 +6994,7 @@
         </w:rPr>
         <w:t>land_use</w:t>
       </w:r>
+      <w:proofErr w:type="spellEnd"/>
       <w:r>
         <w:rPr>
           <w:rFonts w:ascii="Serif" w:hAnsi="Serif"/>
@@ -6157,6 +7071,7 @@
         </w:rPr>
         <w:t xml:space="preserve">, and </w:t>
       </w:r>
+      <w:proofErr w:type="spellStart"/>
       <w:r>
         <w:rPr>
           <w:rFonts w:ascii="Serif" w:hAnsi="Serif"/>
@@ -6165,11 +7080,26 @@
         </w:rPr>
         <w:t>land_use</w:t>
       </w:r>
-      <w:r>
-        <w:rPr>
-          <w:rFonts w:ascii="Serif" w:hAnsi="Serif"/>
-        </w:rPr>
-        <w:t xml:space="preserve"> (GeeksforGeeks, 2024). Finally, Linear Regression was applied again to estimate missing values in </w:t>
+      <w:proofErr w:type="spellEnd"/>
+      <w:r>
+        <w:rPr>
+          <w:rFonts w:ascii="Serif" w:hAnsi="Serif"/>
+        </w:rPr>
+        <w:t xml:space="preserve"> (</w:t>
+      </w:r>
+      <w:proofErr w:type="spellStart"/>
+      <w:r>
+        <w:rPr>
+          <w:rFonts w:ascii="Serif" w:hAnsi="Serif"/>
+        </w:rPr>
+        <w:t>GeeksforGeeks</w:t>
+      </w:r>
+      <w:proofErr w:type="spellEnd"/>
+      <w:r>
+        <w:rPr>
+          <w:rFonts w:ascii="Serif" w:hAnsi="Serif"/>
+        </w:rPr>
+        <w:t xml:space="preserve">, 2024). Finally, Linear Regression was applied again to estimate missing values in </w:t>
       </w:r>
       <w:r>
         <w:rPr>
@@ -6177,7 +7107,25 @@
           <w:i/>
           <w:iCs/>
         </w:rPr>
-        <w:t>co2_gross_emissions_cattle_deforestation_5_year_total_exposure and co2_net_emissions_cattle_deforestation_5_year_total_exposure</w:t>
+        <w:t>co2_gross_emissions_cattle_deforestation_5_year_total_exposure and co2_net_emissions_cattle_deforestation_5_</w:t>
+      </w:r>
+      <w:proofErr w:type="gramStart"/>
+      <w:r>
+        <w:rPr>
+          <w:rFonts w:ascii="Serif" w:hAnsi="Serif"/>
+          <w:i/>
+          <w:iCs/>
+        </w:rPr>
+        <w:t>year_total</w:t>
+      </w:r>
+      <w:proofErr w:type="gramEnd"/>
+      <w:r>
+        <w:rPr>
+          <w:rFonts w:ascii="Serif" w:hAnsi="Serif"/>
+          <w:i/>
+          <w:iCs/>
+        </w:rPr>
+        <w:t>_exposure</w:t>
       </w:r>
       <w:r>
         <w:rPr>
@@ -6230,7 +7178,57 @@
         <w:rPr>
           <w:rFonts w:ascii="Serif" w:hAnsi="Serif"/>
         </w:rPr>
-        <w:t>The dataset had invalid entries such as &amp;# and special characters like quotation marks (“ ”). To fix this, the column was converted to a string using astype(), and the unwanted characters were removed using the replace() function. (pandas.pydata.org, n.d.)</w:t>
+        <w:t xml:space="preserve">The dataset had invalid entries such as &amp;# and special characters like quotation marks </w:t>
+      </w:r>
+      <w:proofErr w:type="gramStart"/>
+      <w:r>
+        <w:rPr>
+          <w:rFonts w:ascii="Serif" w:hAnsi="Serif"/>
+        </w:rPr>
+        <w:t>(“ ”</w:t>
+      </w:r>
+      <w:proofErr w:type="gramEnd"/>
+      <w:r>
+        <w:rPr>
+          <w:rFonts w:ascii="Serif" w:hAnsi="Serif"/>
+        </w:rPr>
+        <w:t xml:space="preserve">). To fix this, the column was converted to a string using </w:t>
+      </w:r>
+      <w:proofErr w:type="spellStart"/>
+      <w:proofErr w:type="gramStart"/>
+      <w:r>
+        <w:rPr>
+          <w:rFonts w:ascii="Serif" w:hAnsi="Serif"/>
+        </w:rPr>
+        <w:t>astype</w:t>
+      </w:r>
+      <w:proofErr w:type="spellEnd"/>
+      <w:r>
+        <w:rPr>
+          <w:rFonts w:ascii="Serif" w:hAnsi="Serif"/>
+        </w:rPr>
+        <w:t>(</w:t>
+      </w:r>
+      <w:proofErr w:type="gramEnd"/>
+      <w:r>
+        <w:rPr>
+          <w:rFonts w:ascii="Serif" w:hAnsi="Serif"/>
+        </w:rPr>
+        <w:t xml:space="preserve">), and the unwanted characters were removed using the </w:t>
+      </w:r>
+      <w:proofErr w:type="gramStart"/>
+      <w:r>
+        <w:rPr>
+          <w:rFonts w:ascii="Serif" w:hAnsi="Serif"/>
+        </w:rPr>
+        <w:t>replace(</w:t>
+      </w:r>
+      <w:proofErr w:type="gramEnd"/>
+      <w:r>
+        <w:rPr>
+          <w:rFonts w:ascii="Serif" w:hAnsi="Serif"/>
+        </w:rPr>
+        <w:t>) function. (pandas.pydata.org, n.d.)</w:t>
       </w:r>
     </w:p>
     <w:p>
@@ -6292,14 +7290,27 @@
                             <w:r>
                               <w:t xml:space="preserve">Figure </w:t>
                             </w:r>
-                            <w:fldSimple w:instr=" SEQ Figure \* ARABIC ">
-                              <w:r>
-                                <w:rPr>
-                                  <w:noProof/>
-                                </w:rPr>
-                                <w:t>9</w:t>
-                              </w:r>
-                            </w:fldSimple>
+                            <w:r>
+                              <w:fldChar w:fldCharType="begin"/>
+                            </w:r>
+                            <w:r>
+                              <w:instrText xml:space="preserve"> SEQ Figure \* ARABIC </w:instrText>
+                            </w:r>
+                            <w:r>
+                              <w:fldChar w:fldCharType="separate"/>
+                            </w:r>
+                            <w:r>
+                              <w:rPr>
+                                <w:noProof/>
+                              </w:rPr>
+                              <w:t>9</w:t>
+                            </w:r>
+                            <w:r>
+                              <w:rPr>
+                                <w:noProof/>
+                              </w:rPr>
+                              <w:fldChar w:fldCharType="end"/>
+                            </w:r>
                             <w:r>
                               <w:t>-</w:t>
                             </w:r>
@@ -6339,14 +7350,27 @@
                       <w:r>
                         <w:t xml:space="preserve">Figure </w:t>
                       </w:r>
-                      <w:fldSimple w:instr=" SEQ Figure \* ARABIC ">
-                        <w:r>
-                          <w:rPr>
-                            <w:noProof/>
-                          </w:rPr>
-                          <w:t>9</w:t>
-                        </w:r>
-                      </w:fldSimple>
+                      <w:r>
+                        <w:fldChar w:fldCharType="begin"/>
+                      </w:r>
+                      <w:r>
+                        <w:instrText xml:space="preserve"> SEQ Figure \* ARABIC </w:instrText>
+                      </w:r>
+                      <w:r>
+                        <w:fldChar w:fldCharType="separate"/>
+                      </w:r>
+                      <w:r>
+                        <w:rPr>
+                          <w:noProof/>
+                        </w:rPr>
+                        <w:t>9</w:t>
+                      </w:r>
+                      <w:r>
+                        <w:rPr>
+                          <w:noProof/>
+                        </w:rPr>
+                        <w:fldChar w:fldCharType="end"/>
+                      </w:r>
                       <w:r>
                         <w:t>-</w:t>
                       </w:r>
@@ -6489,6 +7513,7 @@
         </w:rPr>
         <w:t xml:space="preserve"> (Amazon) were also removed. The </w:t>
       </w:r>
+      <w:proofErr w:type="spellStart"/>
       <w:r>
         <w:rPr>
           <w:rFonts w:ascii="Serif" w:hAnsi="Serif"/>
@@ -6497,6 +7522,7 @@
         </w:rPr>
         <w:t>importer_group</w:t>
       </w:r>
+      <w:proofErr w:type="spellEnd"/>
       <w:r>
         <w:rPr>
           <w:rFonts w:ascii="Serif" w:hAnsi="Serif"/>
@@ -6577,14 +7603,27 @@
                             <w:r>
                               <w:t xml:space="preserve">Figure </w:t>
                             </w:r>
-                            <w:fldSimple w:instr=" SEQ Figure \* ARABIC ">
-                              <w:r>
-                                <w:rPr>
-                                  <w:noProof/>
-                                </w:rPr>
-                                <w:t>10</w:t>
-                              </w:r>
-                            </w:fldSimple>
+                            <w:r>
+                              <w:fldChar w:fldCharType="begin"/>
+                            </w:r>
+                            <w:r>
+                              <w:instrText xml:space="preserve"> SEQ Figure \* ARABIC </w:instrText>
+                            </w:r>
+                            <w:r>
+                              <w:fldChar w:fldCharType="separate"/>
+                            </w:r>
+                            <w:r>
+                              <w:rPr>
+                                <w:noProof/>
+                              </w:rPr>
+                              <w:t>10</w:t>
+                            </w:r>
+                            <w:r>
+                              <w:rPr>
+                                <w:noProof/>
+                              </w:rPr>
+                              <w:fldChar w:fldCharType="end"/>
+                            </w:r>
                             <w:r>
                               <w:t>-</w:t>
                             </w:r>
@@ -6624,14 +7663,27 @@
                       <w:r>
                         <w:t xml:space="preserve">Figure </w:t>
                       </w:r>
-                      <w:fldSimple w:instr=" SEQ Figure \* ARABIC ">
-                        <w:r>
-                          <w:rPr>
-                            <w:noProof/>
-                          </w:rPr>
-                          <w:t>10</w:t>
-                        </w:r>
-                      </w:fldSimple>
+                      <w:r>
+                        <w:fldChar w:fldCharType="begin"/>
+                      </w:r>
+                      <w:r>
+                        <w:instrText xml:space="preserve"> SEQ Figure \* ARABIC </w:instrText>
+                      </w:r>
+                      <w:r>
+                        <w:fldChar w:fldCharType="separate"/>
+                      </w:r>
+                      <w:r>
+                        <w:rPr>
+                          <w:noProof/>
+                        </w:rPr>
+                        <w:t>10</w:t>
+                      </w:r>
+                      <w:r>
+                        <w:rPr>
+                          <w:noProof/>
+                        </w:rPr>
+                        <w:fldChar w:fldCharType="end"/>
+                      </w:r>
                       <w:r>
                         <w:t>-</w:t>
                       </w:r>
@@ -6853,7 +7905,21 @@
         <w:rPr>
           <w:rFonts w:ascii="Serif" w:hAnsi="Serif"/>
         </w:rPr>
-        <w:t>methods, such as one hot enconding,</w:t>
+        <w:t xml:space="preserve">methods, such as one hot </w:t>
+      </w:r>
+      <w:proofErr w:type="spellStart"/>
+      <w:r>
+        <w:rPr>
+          <w:rFonts w:ascii="Serif" w:hAnsi="Serif"/>
+        </w:rPr>
+        <w:t>enconding</w:t>
+      </w:r>
+      <w:proofErr w:type="spellEnd"/>
+      <w:r>
+        <w:rPr>
+          <w:rFonts w:ascii="Serif" w:hAnsi="Serif"/>
+        </w:rPr>
+        <w:t>,</w:t>
       </w:r>
       <w:r>
         <w:rPr>
@@ -7015,7 +8081,21 @@
         <w:rPr>
           <w:rFonts w:ascii="Serif" w:hAnsi="Serif"/>
         </w:rPr>
-        <w:t>(GeeksforGeeks, 2018)</w:t>
+        <w:t>(</w:t>
+      </w:r>
+      <w:proofErr w:type="spellStart"/>
+      <w:r>
+        <w:rPr>
+          <w:rFonts w:ascii="Serif" w:hAnsi="Serif"/>
+        </w:rPr>
+        <w:t>GeeksforGeeks</w:t>
+      </w:r>
+      <w:proofErr w:type="spellEnd"/>
+      <w:r>
+        <w:rPr>
+          <w:rFonts w:ascii="Serif" w:hAnsi="Serif"/>
+        </w:rPr>
+        <w:t>, 2018)</w:t>
       </w:r>
     </w:p>
     <w:p>
@@ -7029,7 +8109,35 @@
         <w:rPr>
           <w:rFonts w:ascii="Serif" w:hAnsi="Serif"/>
         </w:rPr>
-        <w:t>The second choice was K-Nearest Neighbours (KNN), as it predicts values based on distance calculations between data points by identifying the nearest neighbours and estimating outcomes based on their average. However, this model may not be the most suitable for this dataset, as highly correlated features can affect distance measurements</w:t>
+        <w:t xml:space="preserve">The second choice was K-Nearest </w:t>
+      </w:r>
+      <w:proofErr w:type="spellStart"/>
+      <w:r>
+        <w:rPr>
+          <w:rFonts w:ascii="Serif" w:hAnsi="Serif"/>
+        </w:rPr>
+        <w:t>Neighbours</w:t>
+      </w:r>
+      <w:proofErr w:type="spellEnd"/>
+      <w:r>
+        <w:rPr>
+          <w:rFonts w:ascii="Serif" w:hAnsi="Serif"/>
+        </w:rPr>
+        <w:t xml:space="preserve"> (KNN), as it predicts values based on distance calculations between data points by identifying the nearest </w:t>
+      </w:r>
+      <w:proofErr w:type="spellStart"/>
+      <w:r>
+        <w:rPr>
+          <w:rFonts w:ascii="Serif" w:hAnsi="Serif"/>
+        </w:rPr>
+        <w:t>neighbours</w:t>
+      </w:r>
+      <w:proofErr w:type="spellEnd"/>
+      <w:r>
+        <w:rPr>
+          <w:rFonts w:ascii="Serif" w:hAnsi="Serif"/>
+        </w:rPr>
+        <w:t xml:space="preserve"> and estimating outcomes based on their average. However, this model may not be the most suitable for this dataset, as highly correlated features can affect distance measurements</w:t>
       </w:r>
       <w:r>
         <w:rPr>
@@ -7119,7 +8227,21 @@
         <w:rPr>
           <w:rFonts w:ascii="Serif" w:hAnsi="Serif"/>
         </w:rPr>
-        <w:t xml:space="preserve"> necessary. RobustScaler </w:t>
+        <w:t xml:space="preserve"> necessary. </w:t>
+      </w:r>
+      <w:proofErr w:type="spellStart"/>
+      <w:r>
+        <w:rPr>
+          <w:rFonts w:ascii="Serif" w:hAnsi="Serif"/>
+        </w:rPr>
+        <w:t>RobustScaler</w:t>
+      </w:r>
+      <w:proofErr w:type="spellEnd"/>
+      <w:r>
+        <w:rPr>
+          <w:rFonts w:ascii="Serif" w:hAnsi="Serif"/>
+        </w:rPr>
+        <w:t xml:space="preserve"> </w:t>
       </w:r>
       <w:r>
         <w:rPr>
@@ -7441,7 +8563,21 @@
         <w:rPr>
           <w:rFonts w:ascii="Serif" w:hAnsi="Serif"/>
         </w:rPr>
-        <w:t>4.3.1 - K-Nearest Neighbours Regressor (KNN)</w:t>
+        <w:t xml:space="preserve">4.3.1 - K-Nearest </w:t>
+      </w:r>
+      <w:proofErr w:type="spellStart"/>
+      <w:r>
+        <w:rPr>
+          <w:rFonts w:ascii="Serif" w:hAnsi="Serif"/>
+        </w:rPr>
+        <w:t>Neighbours</w:t>
+      </w:r>
+      <w:proofErr w:type="spellEnd"/>
+      <w:r>
+        <w:rPr>
+          <w:rFonts w:ascii="Serif" w:hAnsi="Serif"/>
+        </w:rPr>
+        <w:t xml:space="preserve"> Regressor (KNN)</w:t>
       </w:r>
       <w:bookmarkEnd w:id="57"/>
     </w:p>
@@ -7456,7 +8592,35 @@
         <w:rPr>
           <w:rFonts w:ascii="Serif" w:hAnsi="Serif"/>
         </w:rPr>
-        <w:t>For this model, after splitting the data, we scaled the data using RobustScaler due to the presence of outliers. RobustScaler removes the median and scales the data using the interquartile range (IQR), making it less sensitive to extreme values compared to standard scaling</w:t>
+        <w:t xml:space="preserve">For this model, after splitting the data, we scaled the data using </w:t>
+      </w:r>
+      <w:proofErr w:type="spellStart"/>
+      <w:r>
+        <w:rPr>
+          <w:rFonts w:ascii="Serif" w:hAnsi="Serif"/>
+        </w:rPr>
+        <w:t>RobustScaler</w:t>
+      </w:r>
+      <w:proofErr w:type="spellEnd"/>
+      <w:r>
+        <w:rPr>
+          <w:rFonts w:ascii="Serif" w:hAnsi="Serif"/>
+        </w:rPr>
+        <w:t xml:space="preserve"> due to the presence of outliers. </w:t>
+      </w:r>
+      <w:proofErr w:type="spellStart"/>
+      <w:r>
+        <w:rPr>
+          <w:rFonts w:ascii="Serif" w:hAnsi="Serif"/>
+        </w:rPr>
+        <w:t>RobustScaler</w:t>
+      </w:r>
+      <w:proofErr w:type="spellEnd"/>
+      <w:r>
+        <w:rPr>
+          <w:rFonts w:ascii="Serif" w:hAnsi="Serif"/>
+        </w:rPr>
+        <w:t xml:space="preserve"> removes the median and scales the data using the interquartile range (IQR), making it less sensitive to extreme values compared to standard scaling</w:t>
       </w:r>
       <w:r>
         <w:rPr>
@@ -7562,6 +8726,12 @@
                 <w:rFonts w:ascii="Serif" w:hAnsi="Serif"/>
               </w:rPr>
               <w:tab/>
+            </w:r>
+            <w:proofErr w:type="spellStart"/>
+            <w:r>
+              <w:rPr>
+                <w:rFonts w:ascii="Serif" w:hAnsi="Serif"/>
+              </w:rPr>
               <w:t>n_neighbo</w:t>
             </w:r>
             <w:r>
@@ -7576,6 +8746,7 @@
               </w:rPr>
               <w:t>rs</w:t>
             </w:r>
+            <w:proofErr w:type="spellEnd"/>
           </w:p>
         </w:tc>
         <w:tc>
@@ -7681,7 +8852,35 @@
               <w:rPr>
                 <w:rFonts w:ascii="Serif" w:hAnsi="Serif"/>
               </w:rPr>
-              <w:t>"euclidean", "manhattan"</w:t>
+              <w:t>"</w:t>
+            </w:r>
+            <w:proofErr w:type="spellStart"/>
+            <w:r>
+              <w:rPr>
+                <w:rFonts w:ascii="Serif" w:hAnsi="Serif"/>
+              </w:rPr>
+              <w:t>euclidean</w:t>
+            </w:r>
+            <w:proofErr w:type="spellEnd"/>
+            <w:r>
+              <w:rPr>
+                <w:rFonts w:ascii="Serif" w:hAnsi="Serif"/>
+              </w:rPr>
+              <w:t>", "</w:t>
+            </w:r>
+            <w:proofErr w:type="spellStart"/>
+            <w:r>
+              <w:rPr>
+                <w:rFonts w:ascii="Serif" w:hAnsi="Serif"/>
+              </w:rPr>
+              <w:t>manhattan</w:t>
+            </w:r>
+            <w:proofErr w:type="spellEnd"/>
+            <w:r>
+              <w:rPr>
+                <w:rFonts w:ascii="Serif" w:hAnsi="Serif"/>
+              </w:rPr>
+              <w:t>"</w:t>
             </w:r>
           </w:p>
         </w:tc>
@@ -7706,7 +8905,49 @@
         <w:rPr>
           <w:rFonts w:ascii="Serif" w:hAnsi="Serif"/>
         </w:rPr>
-        <w:t>For the n_neighbours hyperparameter, larger values were selected instead of very small values because the dataset contains highly correlated and very similar features. Very small neighbour values can make the KNN model too sensitive to local patterns and nearby observations, increasing the risk of overfitting. Larger neighbour values help make predictions more stable by using more nearby observations instead of only a few very similar points. This is important for this dataset, which contains highly correlated features.</w:t>
+        <w:t xml:space="preserve">For the </w:t>
+      </w:r>
+      <w:proofErr w:type="spellStart"/>
+      <w:r>
+        <w:rPr>
+          <w:rFonts w:ascii="Serif" w:hAnsi="Serif"/>
+        </w:rPr>
+        <w:t>n_neighbours</w:t>
+      </w:r>
+      <w:proofErr w:type="spellEnd"/>
+      <w:r>
+        <w:rPr>
+          <w:rFonts w:ascii="Serif" w:hAnsi="Serif"/>
+        </w:rPr>
+        <w:t xml:space="preserve"> hyperparameter, larger values were selected instead of very small values because the dataset contains highly correlated and very similar features. Very small </w:t>
+      </w:r>
+      <w:proofErr w:type="spellStart"/>
+      <w:r>
+        <w:rPr>
+          <w:rFonts w:ascii="Serif" w:hAnsi="Serif"/>
+        </w:rPr>
+        <w:t>neighbour</w:t>
+      </w:r>
+      <w:proofErr w:type="spellEnd"/>
+      <w:r>
+        <w:rPr>
+          <w:rFonts w:ascii="Serif" w:hAnsi="Serif"/>
+        </w:rPr>
+        <w:t xml:space="preserve"> values can make the KNN model too sensitive to local patterns and nearby observations, increasing the risk of overfitting. Larger </w:t>
+      </w:r>
+      <w:proofErr w:type="spellStart"/>
+      <w:r>
+        <w:rPr>
+          <w:rFonts w:ascii="Serif" w:hAnsi="Serif"/>
+        </w:rPr>
+        <w:t>neighbour</w:t>
+      </w:r>
+      <w:proofErr w:type="spellEnd"/>
+      <w:r>
+        <w:rPr>
+          <w:rFonts w:ascii="Serif" w:hAnsi="Serif"/>
+        </w:rPr>
+        <w:t xml:space="preserve"> values help make predictions more stable by using more nearby observations instead of only a few very similar points. This is important for this dataset, which contains highly correlated features.</w:t>
       </w:r>
       <w:r>
         <w:rPr>
@@ -7732,7 +8973,21 @@
         <w:rPr>
           <w:rFonts w:ascii="Serif" w:hAnsi="Serif"/>
         </w:rPr>
-        <w:t>For the weights hyperparameter,</w:t>
+        <w:t xml:space="preserve">For the </w:t>
+      </w:r>
+      <w:proofErr w:type="gramStart"/>
+      <w:r>
+        <w:rPr>
+          <w:rFonts w:ascii="Serif" w:hAnsi="Serif"/>
+        </w:rPr>
+        <w:t>weights</w:t>
+      </w:r>
+      <w:proofErr w:type="gramEnd"/>
+      <w:r>
+        <w:rPr>
+          <w:rFonts w:ascii="Serif" w:hAnsi="Serif"/>
+        </w:rPr>
+        <w:t xml:space="preserve"> hyperparameter,</w:t>
       </w:r>
       <w:r>
         <w:rPr>
@@ -7744,8 +8999,16 @@
         <w:rPr>
           <w:rFonts w:ascii="Serif" w:hAnsi="Serif"/>
         </w:rPr>
-        <w:t>we chose the following :</w:t>
-      </w:r>
+        <w:t xml:space="preserve">we chose the </w:t>
+      </w:r>
+      <w:proofErr w:type="gramStart"/>
+      <w:r>
+        <w:rPr>
+          <w:rFonts w:ascii="Serif" w:hAnsi="Serif"/>
+        </w:rPr>
+        <w:t>following :</w:t>
+      </w:r>
+      <w:proofErr w:type="gramEnd"/>
     </w:p>
     <w:p>
       <w:pPr>
@@ -7776,7 +9039,21 @@
         <w:rPr>
           <w:rFonts w:ascii="Serif" w:hAnsi="Serif"/>
         </w:rPr>
-        <w:t xml:space="preserve">Every neighbour </w:t>
+        <w:t xml:space="preserve">Every </w:t>
+      </w:r>
+      <w:proofErr w:type="spellStart"/>
+      <w:r>
+        <w:rPr>
+          <w:rFonts w:ascii="Serif" w:hAnsi="Serif"/>
+        </w:rPr>
+        <w:t>neighbour</w:t>
+      </w:r>
+      <w:proofErr w:type="spellEnd"/>
+      <w:r>
+        <w:rPr>
+          <w:rFonts w:ascii="Serif" w:hAnsi="Serif"/>
+        </w:rPr>
+        <w:t xml:space="preserve"> </w:t>
       </w:r>
       <w:r>
         <w:rPr>
@@ -7844,13 +9121,41 @@
         <w:rPr>
           <w:rFonts w:ascii="Serif" w:hAnsi="Serif"/>
         </w:rPr>
-        <w:t xml:space="preserve"> the neighbour is, the more influence it will have.</w:t>
-      </w:r>
-      <w:r>
-        <w:rPr>
-          <w:rFonts w:ascii="Serif" w:hAnsi="Serif"/>
-        </w:rPr>
-        <w:t>(Piyush Ashtekar, 2025)</w:t>
+        <w:t xml:space="preserve"> the </w:t>
+      </w:r>
+      <w:proofErr w:type="spellStart"/>
+      <w:r>
+        <w:rPr>
+          <w:rFonts w:ascii="Serif" w:hAnsi="Serif"/>
+        </w:rPr>
+        <w:t>neighbour</w:t>
+      </w:r>
+      <w:proofErr w:type="spellEnd"/>
+      <w:r>
+        <w:rPr>
+          <w:rFonts w:ascii="Serif" w:hAnsi="Serif"/>
+        </w:rPr>
+        <w:t xml:space="preserve"> is, the more influence it will </w:t>
+      </w:r>
+      <w:proofErr w:type="gramStart"/>
+      <w:r>
+        <w:rPr>
+          <w:rFonts w:ascii="Serif" w:hAnsi="Serif"/>
+        </w:rPr>
+        <w:t>have.</w:t>
+      </w:r>
+      <w:r>
+        <w:rPr>
+          <w:rFonts w:ascii="Serif" w:hAnsi="Serif"/>
+        </w:rPr>
+        <w:t>(</w:t>
+      </w:r>
+      <w:proofErr w:type="gramEnd"/>
+      <w:r>
+        <w:rPr>
+          <w:rFonts w:ascii="Serif" w:hAnsi="Serif"/>
+        </w:rPr>
+        <w:t>Piyush Ashtekar, 2025)</w:t>
       </w:r>
     </w:p>
     <w:p>
@@ -8011,7 +9316,21 @@
         <w:rPr>
           <w:rFonts w:ascii="Serif" w:hAnsi="Serif"/>
         </w:rPr>
-        <w:t xml:space="preserve"> (GeeksforGeeks, 2020)</w:t>
+        <w:t xml:space="preserve"> (</w:t>
+      </w:r>
+      <w:proofErr w:type="spellStart"/>
+      <w:r>
+        <w:rPr>
+          <w:rFonts w:ascii="Serif" w:hAnsi="Serif"/>
+        </w:rPr>
+        <w:t>GeeksforGeeks</w:t>
+      </w:r>
+      <w:proofErr w:type="spellEnd"/>
+      <w:r>
+        <w:rPr>
+          <w:rFonts w:ascii="Serif" w:hAnsi="Serif"/>
+        </w:rPr>
+        <w:t>, 2020)</w:t>
       </w:r>
       <w:bookmarkEnd w:id="58"/>
     </w:p>
@@ -8141,14 +9460,33 @@
         <w:t>-</w:t>
       </w:r>
       <w:r>
-        <w:t>Formula for Manhattan distance</w:t>
+        <w:t xml:space="preserve">Formula for Manhattan </w:t>
+      </w:r>
+      <w:proofErr w:type="gramStart"/>
+      <w:r>
+        <w:t>distance</w:t>
       </w:r>
       <w:bookmarkEnd w:id="59"/>
       <w:r>
         <w:rPr>
           <w:rFonts w:ascii="Serif" w:hAnsi="Serif"/>
         </w:rPr>
-        <w:t>.(GeeksforGeeks, 2020)</w:t>
+        <w:t>.(</w:t>
+      </w:r>
+      <w:proofErr w:type="spellStart"/>
+      <w:proofErr w:type="gramEnd"/>
+      <w:r>
+        <w:rPr>
+          <w:rFonts w:ascii="Serif" w:hAnsi="Serif"/>
+        </w:rPr>
+        <w:t>GeeksforGeeks</w:t>
+      </w:r>
+      <w:proofErr w:type="spellEnd"/>
+      <w:r>
+        <w:rPr>
+          <w:rFonts w:ascii="Serif" w:hAnsi="Serif"/>
+        </w:rPr>
+        <w:t>, 2020)</w:t>
       </w:r>
     </w:p>
     <w:p>
@@ -8184,7 +9522,35 @@
         <w:rPr>
           <w:rFonts w:ascii="Serif" w:hAnsi="Serif"/>
         </w:rPr>
-        <w:t xml:space="preserve">Based on the model results and the parameters selected by GridSearchCV, we noticed that the KNN model was affected by the correlation between features. Although the model achieved very high results on a single train/test split, the cross-validation results showed that the model did not generalise as well across different data splits. The model performed much better when the </w:t>
+        <w:t xml:space="preserve">Based on the model results and the parameters selected by </w:t>
+      </w:r>
+      <w:proofErr w:type="spellStart"/>
+      <w:r>
+        <w:rPr>
+          <w:rFonts w:ascii="Serif" w:hAnsi="Serif"/>
+        </w:rPr>
+        <w:t>GridSearchCV</w:t>
+      </w:r>
+      <w:proofErr w:type="spellEnd"/>
+      <w:r>
+        <w:rPr>
+          <w:rFonts w:ascii="Serif" w:hAnsi="Serif"/>
+        </w:rPr>
+        <w:t xml:space="preserve">, we noticed that the KNN model was affected by the correlation between features. Although the model achieved very high results on a single train/test split, the cross-validation results showed that the model did not </w:t>
+      </w:r>
+      <w:proofErr w:type="spellStart"/>
+      <w:r>
+        <w:rPr>
+          <w:rFonts w:ascii="Serif" w:hAnsi="Serif"/>
+        </w:rPr>
+        <w:t>generalise</w:t>
+      </w:r>
+      <w:proofErr w:type="spellEnd"/>
+      <w:r>
+        <w:rPr>
+          <w:rFonts w:ascii="Serif" w:hAnsi="Serif"/>
+        </w:rPr>
+        <w:t xml:space="preserve"> as well across different data splits. The model performed much better when the </w:t>
       </w:r>
       <w:r>
         <w:rPr>
@@ -8335,8 +9701,15 @@
                 <w:rFonts w:ascii="Serif" w:hAnsi="Serif"/>
               </w:rPr>
               <w:tab/>
+            </w:r>
+            <w:proofErr w:type="spellStart"/>
+            <w:r>
+              <w:rPr>
+                <w:rFonts w:ascii="Serif" w:hAnsi="Serif"/>
+              </w:rPr>
               <w:t>n_estimators</w:t>
             </w:r>
+            <w:proofErr w:type="spellEnd"/>
           </w:p>
         </w:tc>
         <w:tc>
@@ -8373,12 +9746,14 @@
                 <w:rFonts w:ascii="Serif" w:hAnsi="Serif"/>
               </w:rPr>
             </w:pPr>
+            <w:proofErr w:type="spellStart"/>
             <w:r>
               <w:rPr>
                 <w:rFonts w:ascii="Serif" w:hAnsi="Serif"/>
               </w:rPr>
               <w:t>max_depth</w:t>
             </w:r>
+            <w:proofErr w:type="spellEnd"/>
           </w:p>
         </w:tc>
         <w:tc>
@@ -8418,12 +9793,14 @@
                 <w:rFonts w:ascii="Serif" w:hAnsi="Serif"/>
               </w:rPr>
             </w:pPr>
+            <w:proofErr w:type="spellStart"/>
             <w:r>
               <w:rPr>
                 <w:rFonts w:ascii="Serif" w:hAnsi="Serif"/>
               </w:rPr>
               <w:t>min_samples_split</w:t>
             </w:r>
+            <w:proofErr w:type="spellEnd"/>
           </w:p>
         </w:tc>
         <w:tc>
@@ -8460,12 +9837,14 @@
                 <w:rFonts w:ascii="Serif" w:hAnsi="Serif"/>
               </w:rPr>
             </w:pPr>
+            <w:proofErr w:type="spellStart"/>
             <w:r>
               <w:rPr>
                 <w:rFonts w:ascii="Serif" w:hAnsi="Serif"/>
               </w:rPr>
               <w:t>min_samples_leaf</w:t>
             </w:r>
+            <w:proofErr w:type="spellEnd"/>
           </w:p>
         </w:tc>
         <w:tc>
@@ -8505,12 +9884,14 @@
                 <w:rFonts w:ascii="Serif" w:hAnsi="Serif"/>
               </w:rPr>
             </w:pPr>
+            <w:proofErr w:type="spellStart"/>
             <w:r>
               <w:rPr>
                 <w:rFonts w:ascii="Serif" w:hAnsi="Serif"/>
               </w:rPr>
               <w:t>max_features</w:t>
             </w:r>
+            <w:proofErr w:type="spellEnd"/>
           </w:p>
         </w:tc>
         <w:tc>
@@ -8555,47 +9936,89 @@
         </w:rPr>
         <w:t xml:space="preserve">For the Random Forest model, the search space was chosen to improve performance while avoiding long training times. Different </w:t>
       </w:r>
+      <w:proofErr w:type="spellStart"/>
       <w:r>
         <w:rPr>
           <w:rFonts w:ascii="Serif" w:hAnsi="Serif"/>
           <w:i/>
           <w:iCs/>
         </w:rPr>
-        <w:t>n_estimators</w:t>
-      </w:r>
-      <w:r>
-        <w:rPr>
-          <w:rFonts w:ascii="Serif" w:hAnsi="Serif"/>
-        </w:rPr>
-        <w:t xml:space="preserve"> values were tested to evaluate the number of trees used in the model, as more trees can improve performance but also increase computation time. The </w:t>
-      </w:r>
+        <w:t>n_</w:t>
+      </w:r>
+      <w:proofErr w:type="gramStart"/>
       <w:r>
         <w:rPr>
           <w:rFonts w:ascii="Serif" w:hAnsi="Serif"/>
           <w:i/>
           <w:iCs/>
         </w:rPr>
-        <w:t>max_depth</w:t>
-      </w:r>
-      <w:r>
-        <w:rPr>
-          <w:rFonts w:ascii="Serif" w:hAnsi="Serif"/>
-        </w:rPr>
-        <w:t xml:space="preserve"> values were limited to reduce overfitting, while min_samples_split and min_samples_leaf were adjusted to make the trees less complex and improve generalisation. Finally, the </w:t>
-      </w:r>
+        <w:t>estimators</w:t>
+      </w:r>
+      <w:proofErr w:type="spellEnd"/>
+      <w:proofErr w:type="gramEnd"/>
+      <w:r>
+        <w:rPr>
+          <w:rFonts w:ascii="Serif" w:hAnsi="Serif"/>
+        </w:rPr>
+        <w:t xml:space="preserve"> values were tested to evaluate the number of trees used in the model, as more trees can improve performance but also increase computation time. The </w:t>
+      </w:r>
+      <w:proofErr w:type="spellStart"/>
       <w:r>
         <w:rPr>
           <w:rFonts w:ascii="Serif" w:hAnsi="Serif"/>
           <w:i/>
           <w:iCs/>
         </w:rPr>
-        <w:t>sqrt and log2</w:t>
-      </w:r>
-      <w:r>
-        <w:rPr>
-          <w:rFonts w:ascii="Serif" w:hAnsi="Serif"/>
-        </w:rPr>
-        <w:t xml:space="preserve"> options were tested for </w:t>
+        <w:t>max_depth</w:t>
+      </w:r>
+      <w:proofErr w:type="spellEnd"/>
+      <w:r>
+        <w:rPr>
+          <w:rFonts w:ascii="Serif" w:hAnsi="Serif"/>
+        </w:rPr>
+        <w:t xml:space="preserve"> values were limited to reduce overfitting, while </w:t>
+      </w:r>
+      <w:proofErr w:type="spellStart"/>
+      <w:r>
+        <w:rPr>
+          <w:rFonts w:ascii="Serif" w:hAnsi="Serif"/>
+        </w:rPr>
+        <w:t>min_samples_split</w:t>
+      </w:r>
+      <w:proofErr w:type="spellEnd"/>
+      <w:r>
+        <w:rPr>
+          <w:rFonts w:ascii="Serif" w:hAnsi="Serif"/>
+        </w:rPr>
+        <w:t xml:space="preserve"> and </w:t>
+      </w:r>
+      <w:proofErr w:type="spellStart"/>
+      <w:r>
+        <w:rPr>
+          <w:rFonts w:ascii="Serif" w:hAnsi="Serif"/>
+        </w:rPr>
+        <w:t>min_samples_leaf</w:t>
+      </w:r>
+      <w:proofErr w:type="spellEnd"/>
+      <w:r>
+        <w:rPr>
+          <w:rFonts w:ascii="Serif" w:hAnsi="Serif"/>
+        </w:rPr>
+        <w:t xml:space="preserve"> were adjusted to make the trees less complex and improve </w:t>
+      </w:r>
+      <w:proofErr w:type="spellStart"/>
+      <w:r>
+        <w:rPr>
+          <w:rFonts w:ascii="Serif" w:hAnsi="Serif"/>
+        </w:rPr>
+        <w:t>generalisation</w:t>
+      </w:r>
+      <w:proofErr w:type="spellEnd"/>
+      <w:r>
+        <w:rPr>
+          <w:rFonts w:ascii="Serif" w:hAnsi="Serif"/>
+        </w:rPr>
+        <w:t xml:space="preserve">. Finally, the </w:t>
       </w:r>
       <w:r>
         <w:rPr>
@@ -8603,13 +10026,51 @@
           <w:i/>
           <w:iCs/>
         </w:rPr>
+        <w:t>sqrt and log2</w:t>
+      </w:r>
+      <w:r>
+        <w:rPr>
+          <w:rFonts w:ascii="Serif" w:hAnsi="Serif"/>
+        </w:rPr>
+        <w:t xml:space="preserve"> options were tested for </w:t>
+      </w:r>
+      <w:proofErr w:type="spellStart"/>
+      <w:r>
+        <w:rPr>
+          <w:rFonts w:ascii="Serif" w:hAnsi="Serif"/>
+          <w:i/>
+          <w:iCs/>
+        </w:rPr>
         <w:t>max_features</w:t>
       </w:r>
-      <w:r>
-        <w:rPr>
-          <w:rFonts w:ascii="Serif" w:hAnsi="Serif"/>
-        </w:rPr>
-        <w:t xml:space="preserve"> because they increase randomness between trees, which can help reduce overfitting and improve generalisation.(Kurui, 2025)</w:t>
+      <w:proofErr w:type="spellEnd"/>
+      <w:r>
+        <w:rPr>
+          <w:rFonts w:ascii="Serif" w:hAnsi="Serif"/>
+        </w:rPr>
+        <w:t xml:space="preserve"> because they increase randomness between trees, which can help reduce overfitting and improve </w:t>
+      </w:r>
+      <w:proofErr w:type="spellStart"/>
+      <w:proofErr w:type="gramStart"/>
+      <w:r>
+        <w:rPr>
+          <w:rFonts w:ascii="Serif" w:hAnsi="Serif"/>
+        </w:rPr>
+        <w:t>generalisation</w:t>
+      </w:r>
+      <w:proofErr w:type="spellEnd"/>
+      <w:r>
+        <w:rPr>
+          <w:rFonts w:ascii="Serif" w:hAnsi="Serif"/>
+        </w:rPr>
+        <w:t>.(</w:t>
+      </w:r>
+      <w:proofErr w:type="gramEnd"/>
+      <w:r>
+        <w:rPr>
+          <w:rFonts w:ascii="Serif" w:hAnsi="Serif"/>
+        </w:rPr>
+        <w:t>Kurui, 2025)</w:t>
       </w:r>
     </w:p>
     <w:p>
@@ -8637,7 +10098,21 @@
         <w:rPr>
           <w:rFonts w:ascii="Serif" w:hAnsi="Serif"/>
         </w:rPr>
-        <w:t xml:space="preserve">Based on the Random Forest results and the parameters selected, we noticed that the model did not show strong signs of overfitting and was able to generalise well to unseen </w:t>
+        <w:t xml:space="preserve">Based on the Random Forest results and the parameters selected, we noticed that the model did not show strong signs of overfitting and was able to </w:t>
+      </w:r>
+      <w:proofErr w:type="spellStart"/>
+      <w:r>
+        <w:rPr>
+          <w:rFonts w:ascii="Serif" w:hAnsi="Serif"/>
+        </w:rPr>
+        <w:t>generalise</w:t>
+      </w:r>
+      <w:proofErr w:type="spellEnd"/>
+      <w:r>
+        <w:rPr>
+          <w:rFonts w:ascii="Serif" w:hAnsi="Serif"/>
+        </w:rPr>
+        <w:t xml:space="preserve"> well to unseen </w:t>
       </w:r>
       <w:r>
         <w:rPr>
@@ -8660,7 +10135,21 @@
         <w:rPr>
           <w:rFonts w:ascii="Serif" w:hAnsi="Serif"/>
         </w:rPr>
-        <w:t>4.3.3 – Partial Least Squares Regressor(PLS)</w:t>
+        <w:t xml:space="preserve">4.3.3 – Partial Least Squares </w:t>
+      </w:r>
+      <w:proofErr w:type="gramStart"/>
+      <w:r>
+        <w:rPr>
+          <w:rFonts w:ascii="Serif" w:hAnsi="Serif"/>
+        </w:rPr>
+        <w:t>Regressor(</w:t>
+      </w:r>
+      <w:proofErr w:type="gramEnd"/>
+      <w:r>
+        <w:rPr>
+          <w:rFonts w:ascii="Serif" w:hAnsi="Serif"/>
+        </w:rPr>
+        <w:t>PLS)</w:t>
       </w:r>
       <w:bookmarkEnd w:id="61"/>
     </w:p>
@@ -8734,7 +10223,27 @@
           <w:iCs w:val="0"/>
           <w:color w:val="auto"/>
         </w:rPr>
-        <w:t>For the PLS Regression model, n_components=3 was selected to reduce the dimensionality of the dataset. PLS combines the original features into latent variables that help explain the target variable. Since the model handles multicollinearity well, 3 components were enough to represent the dataset while reducing model complexity</w:t>
+        <w:t xml:space="preserve">For the PLS Regression model, </w:t>
+      </w:r>
+      <w:proofErr w:type="spellStart"/>
+      <w:r>
+        <w:rPr>
+          <w:rFonts w:ascii="Serif" w:eastAsiaTheme="minorHAnsi" w:hAnsi="Serif" w:cstheme="minorBidi"/>
+          <w:i w:val="0"/>
+          <w:iCs w:val="0"/>
+          <w:color w:val="auto"/>
+        </w:rPr>
+        <w:t>n_components</w:t>
+      </w:r>
+      <w:proofErr w:type="spellEnd"/>
+      <w:r>
+        <w:rPr>
+          <w:rFonts w:ascii="Serif" w:eastAsiaTheme="minorHAnsi" w:hAnsi="Serif" w:cstheme="minorBidi"/>
+          <w:i w:val="0"/>
+          <w:iCs w:val="0"/>
+          <w:color w:val="auto"/>
+        </w:rPr>
+        <w:t>=3 was selected to reduce the dimensionality of the dataset. PLS combines the original features into latent variables that help explain the target variable. Since the model handles multicollinearity well, 3 components were enough to represent the dataset while reducing model complexity</w:t>
       </w:r>
     </w:p>
     <w:p>
@@ -8763,7 +10272,21 @@
         <w:rPr>
           <w:rFonts w:ascii="Serif" w:hAnsi="Serif"/>
         </w:rPr>
-        <w:t>Based on the PLS results, we noticed that the model handled correlated features very well and achieved strong and consistent performance across the training, testing, and cross-validation stages, similar to the Random Forest Regressor.</w:t>
+        <w:t xml:space="preserve">Based on the PLS results, we noticed that the model handled correlated features very well and achieved strong and consistent performance across the training, testing, and cross-validation stages, </w:t>
+      </w:r>
+      <w:proofErr w:type="gramStart"/>
+      <w:r>
+        <w:rPr>
+          <w:rFonts w:ascii="Serif" w:hAnsi="Serif"/>
+        </w:rPr>
+        <w:t>similar to</w:t>
+      </w:r>
+      <w:proofErr w:type="gramEnd"/>
+      <w:r>
+        <w:rPr>
+          <w:rFonts w:ascii="Serif" w:hAnsi="Serif"/>
+        </w:rPr>
+        <w:t xml:space="preserve"> the Random Forest Regressor.</w:t>
       </w:r>
     </w:p>
     <w:p>
@@ -8940,14 +10463,56 @@
         <w:rPr>
           <w:rFonts w:ascii="Serif" w:hAnsi="Serif"/>
         </w:rPr>
-        <w:t xml:space="preserve">During the Modelling stage, Grid Search (GridSearchCV) was applied to perform hyperparameter tuning and determine the optimal parameter combinations for the KNN and Random Forest models. We decided to stick with the parameters found by GridSearchCV because of computational limitations. Trying many more parameter combinations to achieve slightly better results would take too much processing time and would not be practical for this project. Model performance was evaluated using Mean Absolute Error (MAE), R² score, and cross-validation results to assess predictive </w:t>
+        <w:t>During the Modelling stage, Grid Search (</w:t>
+      </w:r>
+      <w:proofErr w:type="spellStart"/>
+      <w:r>
+        <w:rPr>
+          <w:rFonts w:ascii="Serif" w:hAnsi="Serif"/>
+        </w:rPr>
+        <w:t>GridSearchCV</w:t>
+      </w:r>
+      <w:proofErr w:type="spellEnd"/>
+      <w:r>
+        <w:rPr>
+          <w:rFonts w:ascii="Serif" w:hAnsi="Serif"/>
+        </w:rPr>
+        <w:t xml:space="preserve">) was applied to perform hyperparameter tuning and determine the optimal parameter combinations for the KNN and Random Forest models. We decided to stick with the parameters found by </w:t>
+      </w:r>
+      <w:proofErr w:type="spellStart"/>
+      <w:r>
+        <w:rPr>
+          <w:rFonts w:ascii="Serif" w:hAnsi="Serif"/>
+        </w:rPr>
+        <w:t>GridSearchCV</w:t>
+      </w:r>
+      <w:proofErr w:type="spellEnd"/>
+      <w:r>
+        <w:rPr>
+          <w:rFonts w:ascii="Serif" w:hAnsi="Serif"/>
+        </w:rPr>
+        <w:t xml:space="preserve"> because of computational limitations. Trying many more parameter combinations to achieve slightly better results would take too much processing time and would not be practical for this project. Model performance was evaluated using Mean Absolute Error (MAE), R² score, and cross-validation results to assess predictive </w:t>
       </w:r>
       <w:r>
         <w:rPr>
           <w:rFonts w:ascii="Serif" w:hAnsi="Serif"/>
         </w:rPr>
         <w:lastRenderedPageBreak/>
-        <w:t>capability and generalisation performance. The three models were ranked in the following order.</w:t>
+        <w:t xml:space="preserve">capability and </w:t>
+      </w:r>
+      <w:proofErr w:type="spellStart"/>
+      <w:r>
+        <w:rPr>
+          <w:rFonts w:ascii="Serif" w:hAnsi="Serif"/>
+        </w:rPr>
+        <w:t>generalisation</w:t>
+      </w:r>
+      <w:proofErr w:type="spellEnd"/>
+      <w:r>
+        <w:rPr>
+          <w:rFonts w:ascii="Serif" w:hAnsi="Serif"/>
+        </w:rPr>
+        <w:t xml:space="preserve"> performance. The three models were ranked in the following order.</w:t>
       </w:r>
     </w:p>
     <w:p>
@@ -8985,6 +10550,11 @@
         </w:rPr>
       </w:pPr>
     </w:p>
+    <w:p/>
+    <w:p/>
+    <w:p/>
+    <w:p/>
+    <w:p/>
     <w:p/>
     <w:sectPr>
       <w:headerReference w:type="default" r:id="rId27"/>

</xml_diff>